<commit_message>
Refresh for final year; remove private legal and personal material
- Remove THEMIS and Mission OS screenshots (named a family court matter and a third party's case)
- Neutral THEMIS copy; drop the June prev page that described a real court case
- Final-year framing, winter 26/27 + summer 27 availability, master's plan
- Add ICARUS asset and a NOW timeline entry; update counters (31 wks, 13 projects, 4 nodes)
- Replace CV download with the new master internship CV

Co-Authored-By: Claude Opus 5.5 <noreply@anthropic.com>
</commit_message>
<xml_diff>
--- a/cv/Karam-Binning-CV.docx
+++ b/cv/Karam-Binning-CV.docx
@@ -2,7 +2,7 @@
 <file path=word/document.xml><?xml version="1.0" encoding="utf-8"?>
 <w:document xmlns:w="http://schemas.openxmlformats.org/wordprocessingml/2006/main" xmlns:m="http://schemas.openxmlformats.org/officeDocument/2006/math" xmlns:r="http://schemas.openxmlformats.org/officeDocument/2006/relationships" xmlns:o="urn:schemas-microsoft-com:office:office" xmlns:v="urn:schemas-microsoft-com:vml" xmlns:w10="urn:schemas-microsoft-com:office:word" xmlns:a="http://schemas.openxmlformats.org/drawingml/2006/main" xmlns:pic="http://schemas.openxmlformats.org/drawingml/2006/picture" xmlns:wp="http://schemas.openxmlformats.org/drawingml/2006/wordprocessingDrawing">
   <w:body>
-    <w:bookmarkStart w:id="15" w:name="karam-binning"/>
+    <w:bookmarkStart w:id="16" w:name="karam-binning"/>
     <w:p>
       <w:pPr>
         <w:pStyle w:val="Heading1"/>
@@ -20,7 +20,10 @@
           <w:b/>
           <w:bCs/>
         </w:rPr>
-        <w:t xml:space="preserve">AI Builder · Founder, Binning.AI · Final-year History &amp; Politics, Loughborough</w:t>
+        <w:t xml:space="preserve">Final-year BA History &amp; Politics, Loughborough University · Independent AI builder</w:t>
+      </w:r>
+      <w:r>
+        <w:br/>
       </w:r>
     </w:p>
     <w:p>
@@ -28,29 +31,35 @@
         <w:pStyle w:val="BodyText"/>
       </w:pPr>
       <w:r>
-        <w:t xml:space="preserve">07951 882002 · K.S.Binning1-24@student.lboro.ac.uk · Luton / Loughborough (London-commutable) · Full UK driving licence</w:t>
-      </w:r>
-      <w:r>
-        <w:t xml:space="preserve"> </w:t>
-      </w:r>
-      <w:r>
-        <w:t xml:space="preserve">Interactive portfolio:</w:t>
-      </w:r>
-      <w:r>
-        <w:t xml:space="preserve"> </w:t>
-      </w:r>
-      <w:r>
-        <w:rPr>
-          <w:i/>
-          <w:iCs/>
-        </w:rPr>
-        <w:t xml:space="preserve">the Binning.AI estate</w:t>
-      </w:r>
-      <w:r>
-        <w:t xml:space="preserve"> </w:t>
-      </w:r>
-      <w:r>
-        <w:t xml:space="preserve">— link provided in covering email</w:t>
+        <w:t xml:space="preserve">K.S.Binning1-24@student.lboro.ac.uk · karambinning@gmail.com · 07951 882002</w:t>
+      </w:r>
+      <w:r>
+        <w:br/>
+      </w:r>
+      <w:r>
+        <w:t xml:space="preserve">Luton / Loughborough (London-commutable) · UK national · Full UK driving licence</w:t>
+      </w:r>
+      <w:r>
+        <w:br/>
+      </w:r>
+      <w:r>
+        <w:t xml:space="preserve">Portfolio: karambinning.github.io/portfolio</w:t>
+      </w:r>
+      <w:r>
+        <w:br/>
+      </w:r>
+      <w:r>
+        <w:rPr>
+          <w:b/>
+          <w:bCs/>
+        </w:rPr>
+        <w:t xml:space="preserve">Available:</w:t>
+      </w:r>
+      <w:r>
+        <w:t xml:space="preserve"> </w:t>
+      </w:r>
+      <w:r>
+        <w:t xml:space="preserve">December 2026 – January 2027 · Summer 2027 (planning a taught master’s in International Security, 2027–28)</w:t>
       </w:r>
     </w:p>
     <w:p>
@@ -74,7 +83,43 @@
         <w:pStyle w:val="FirstParagraph"/>
       </w:pPr>
       <w:r>
-        <w:t xml:space="preserve">Final-year History &amp; Politics student and self-taught AI engineer. Over four months I taught myself to build and shipped a one-person, AI-native software estate — a multi-agent intelligence platform, autonomous agents running on local models across a private device fleet, a safety-critical legal-research system, and a quantitatively-validated trading engine. I work the way modern AI teams do: design the system, ground every claim in real data, verify before trusting. Seeking an applied-AI / technical internship where that builder’s instinct and a humanities analyst’s judgement are both useful.</w:t>
+        <w:t xml:space="preserve">Final-year History and Politics student who builds working AI systems. Since March 2026, with no</w:t>
+      </w:r>
+      <w:r>
+        <w:t xml:space="preserve"> </w:t>
+      </w:r>
+      <w:r>
+        <w:t xml:space="preserve">programming background and Claude as my primary instrument, I have designed and shipped autonomous</w:t>
+      </w:r>
+      <w:r>
+        <w:t xml:space="preserve"> </w:t>
+      </w:r>
+      <w:r>
+        <w:t xml:space="preserve">flight software, a multi-agent infrastructure across a private fleet of machines, and intelligence</w:t>
+      </w:r>
+      <w:r>
+        <w:t xml:space="preserve"> </w:t>
+      </w:r>
+      <w:r>
+        <w:t xml:space="preserve">tooling — alongside a full degree. Academically I work on conflict, security and the international</w:t>
+      </w:r>
+      <w:r>
+        <w:t xml:space="preserve"> </w:t>
+      </w:r>
+      <w:r>
+        <w:t xml:space="preserve">order; technically, on AI systems that verify before they claim. I am looking for an internship</w:t>
+      </w:r>
+      <w:r>
+        <w:t xml:space="preserve"> </w:t>
+      </w:r>
+      <w:r>
+        <w:t xml:space="preserve">where both halves are useful: applied AI, technology and security policy, intelligence analysis or</w:t>
+      </w:r>
+      <w:r>
+        <w:t xml:space="preserve"> </w:t>
+      </w:r>
+      <w:r>
+        <w:t xml:space="preserve">research.</w:t>
       </w:r>
     </w:p>
     <w:p>
@@ -85,31 +130,13 @@
       </w:r>
     </w:p>
     <w:bookmarkEnd w:id="9"/>
-    <w:bookmarkStart w:id="10" w:name="selected-work-binning.ai"/>
+    <w:bookmarkStart w:id="10" w:name="X41abf8ec286738f3c3c6d5e7d8268553b9dbab4"/>
     <w:p>
       <w:pPr>
         <w:pStyle w:val="Heading2"/>
       </w:pPr>
       <w:r>
         <w:t xml:space="preserve">SELECTED WORK — BINNING.AI</w:t>
-      </w:r>
-    </w:p>
-    <w:p>
-      <w:pPr>
-        <w:pStyle w:val="FirstParagraph"/>
-      </w:pPr>
-      <w:r>
-        <w:rPr>
-          <w:b/>
-          <w:bCs/>
-        </w:rPr>
-        <w:t xml:space="preserve">Founder &amp; Director, Binning.AI</w:t>
-      </w:r>
-      <w:r>
-        <w:t xml:space="preserve"> </w:t>
-      </w:r>
-      <w:r>
-        <w:t xml:space="preserve">·</w:t>
       </w:r>
       <w:r>
         <w:t xml:space="preserve"> </w:t>
@@ -119,13 +146,19 @@
           <w:i/>
           <w:iCs/>
         </w:rPr>
-        <w:t xml:space="preserve">March 2026 – present</w:t>
-      </w:r>
-      <w:r>
-        <w:t xml:space="preserve"> </w:t>
-      </w:r>
-      <w:r>
-        <w:t xml:space="preserve">· a one-person AI-native company</w:t>
+        <w:t xml:space="preserve">(independent, March 2026 – present)</w:t>
+      </w:r>
+    </w:p>
+    <w:p>
+      <w:pPr>
+        <w:pStyle w:val="FirstParagraph"/>
+      </w:pPr>
+      <w:r>
+        <w:rPr>
+          <w:b/>
+          <w:bCs/>
+        </w:rPr>
+        <w:t xml:space="preserve">ICARUS — autonomous flight software for a DJI Mini 2</w:t>
       </w:r>
     </w:p>
     <w:p>
@@ -137,29 +170,13 @@
         </w:numPr>
       </w:pPr>
       <w:r>
-        <w:rPr>
-          <w:b/>
-          <w:bCs/>
-        </w:rPr>
-        <w:t xml:space="preserve">KAM — a personal intelligence platform</w:t>
-      </w:r>
-      <w:r>
-        <w:t xml:space="preserve"> </w:t>
-      </w:r>
-      <w:r>
-        <w:t xml:space="preserve">(React 19 · Vite · 40+ modules, fully local). Aggregates live world, financial and OSINT data into one terminal interface with a multi-LLM</w:t>
-      </w:r>
-      <w:r>
-        <w:t xml:space="preserve"> </w:t>
-      </w:r>
-      <w:r>
-        <w:t xml:space="preserve">“council,”</w:t>
-      </w:r>
-      <w:r>
-        <w:t xml:space="preserve"> </w:t>
-      </w:r>
-      <w:r>
-        <w:t xml:space="preserve">in-browser computer vision, and a retrieval-augmented knowledge base. The flagship the rest of the estate is built around.</w:t>
+        <w:t xml:space="preserve">Turned a consumer drone into an autonomous reconnaissance aircraft, with a 2019 Android handset as</w:t>
+      </w:r>
+      <w:r>
+        <w:t xml:space="preserve"> </w:t>
+      </w:r>
+      <w:r>
+        <w:t xml:space="preserve">flight computer, on my own software and at zero cost.</w:t>
       </w:r>
     </w:p>
     <w:p>
@@ -171,42 +188,13 @@
         </w:numPr>
       </w:pPr>
       <w:r>
-        <w:rPr>
-          <w:b/>
-          <w:bCs/>
-        </w:rPr>
-        <w:t xml:space="preserve">An autonomous agent fleet across seven networked machines.</w:t>
-      </w:r>
-      <w:r>
-        <w:t xml:space="preserve"> </w:t>
-      </w:r>
-      <w:r>
-        <w:t xml:space="preserve">A director-orchestrator decomposes goals, assigns acceptance-bound tasks to specialist sub-agents, and — critically —</w:t>
-      </w:r>
-      <w:r>
-        <w:t xml:space="preserve"> </w:t>
-      </w:r>
-      <w:r>
-        <w:rPr>
-          <w:b/>
-          <w:bCs/>
-        </w:rPr>
-        <w:t xml:space="preserve">no agent can mark its own work done</w:t>
-      </w:r>
-      <w:r>
-        <w:t xml:space="preserve">: an independent verification gate, not self-reported success. All on local open models (Ollama / llama.cpp), under deterministic supervision. Diagnosed my own earlier fleet as</w:t>
-      </w:r>
-      <w:r>
-        <w:t xml:space="preserve"> </w:t>
-      </w:r>
-      <w:r>
-        <w:t xml:space="preserve">“theatre”</w:t>
-      </w:r>
-      <w:r>
-        <w:t xml:space="preserve"> </w:t>
-      </w:r>
-      <w:r>
-        <w:t xml:space="preserve">and rebuilt it scientifically.</w:t>
+        <w:t xml:space="preserve">11,615 lines of Java across fourteen classes; 365 self-test assertions run on the physical handset</w:t>
+      </w:r>
+      <w:r>
+        <w:t xml:space="preserve"> </w:t>
+      </w:r>
+      <w:r>
+        <w:t xml:space="preserve">at every launch and have repeatedly caught regressions before flight.</w:t>
       </w:r>
     </w:p>
     <w:p>
@@ -218,33 +206,31 @@
         </w:numPr>
       </w:pPr>
       <w:r>
-        <w:rPr>
-          <w:b/>
-          <w:bCs/>
-        </w:rPr>
-        <w:t xml:space="preserve">THEMIS — a safety-critical legal RAG.</w:t>
-      </w:r>
-      <w:r>
-        <w:t xml:space="preserve"> </w:t>
-      </w:r>
-      <w:r>
-        <w:t xml:space="preserve">Hybrid (dense + BM25) retrieval over a structured legal corpus with an</w:t>
-      </w:r>
-      <w:r>
-        <w:t xml:space="preserve"> </w:t>
-      </w:r>
-      <w:r>
-        <w:rPr>
-          <w:i/>
-          <w:iCs/>
-        </w:rPr>
-        <w:t xml:space="preserve">abstention gate</w:t>
-      </w:r>
-      <w:r>
-        <w:t xml:space="preserve"> </w:t>
-      </w:r>
-      <w:r>
-        <w:t xml:space="preserve">that refuses rather than hallucinate — built after reading the literature on how legal AI gets people sanctioned, and implementing the mitigations. Local-only for privacy.</w:t>
+        <w:t xml:space="preserve">The control law carries its own safety envelope because the airframe has no obstacle sensing.</w:t>
+      </w:r>
+      <w:r>
+        <w:t xml:space="preserve"> </w:t>
+      </w:r>
+      <w:r>
+        <w:t xml:space="preserve">Three crashes documented with the fault each exposed; one feature paused on a measured physical</w:t>
+      </w:r>
+      <w:r>
+        <w:t xml:space="preserve"> </w:t>
+      </w:r>
+      <w:r>
+        <w:t xml:space="preserve">limit (the camera cannot resolve a hand beyond 5.8 m) rather than shipped on a guess.</w:t>
+      </w:r>
+    </w:p>
+    <w:p>
+      <w:pPr>
+        <w:pStyle w:val="FirstParagraph"/>
+      </w:pPr>
+      <w:r>
+        <w:rPr>
+          <w:b/>
+          <w:bCs/>
+        </w:rPr>
+        <w:t xml:space="preserve">Agentic infrastructure — the system the work runs on</w:t>
       </w:r>
     </w:p>
     <w:p>
@@ -252,34 +238,17 @@
         <w:pStyle w:val="Compact"/>
         <w:numPr>
           <w:ilvl w:val="0"/>
-          <w:numId w:val="1001"/>
+          <w:numId w:val="1002"/>
         </w:numPr>
       </w:pPr>
       <w:r>
-        <w:rPr>
-          <w:b/>
-          <w:bCs/>
-        </w:rPr>
-        <w:t xml:space="preserve">A validated trading engine.</w:t>
-      </w:r>
-      <w:r>
-        <w:t xml:space="preserve"> </w:t>
-      </w:r>
-      <w:r>
-        <w:t xml:space="preserve">A multi-agent Polymarket engine (proven +113% on paper, 289 trades) and an in-play sports model whose edge I validated with</w:t>
-      </w:r>
-      <w:r>
-        <w:t xml:space="preserve"> </w:t>
-      </w:r>
-      <w:r>
-        <w:rPr>
-          <w:b/>
-          <w:bCs/>
-        </w:rPr>
-        <w:t xml:space="preserve">closing-line value and Brier score</w:t>
-      </w:r>
-      <w:r>
-        <w:t xml:space="preserve">, not just P&amp;L — the gold-standard, variance-resistant test of real edge.</w:t>
+        <w:t xml:space="preserve">A private mesh of four Macs, with a single command</w:t>
+      </w:r>
+      <w:r>
+        <w:t xml:space="preserve"> </w:t>
+      </w:r>
+      <w:r>
+        <w:t xml:space="preserve">centre and a 12 TB canonical archive of every project, session and note.</w:t>
       </w:r>
     </w:p>
     <w:p>
@@ -287,21 +256,241 @@
         <w:pStyle w:val="Compact"/>
         <w:numPr>
           <w:ilvl w:val="0"/>
-          <w:numId w:val="1001"/>
+          <w:numId w:val="1002"/>
         </w:numPr>
       </w:pPr>
       <w:r>
-        <w:rPr>
-          <w:b/>
-          <w:bCs/>
-        </w:rPr>
-        <w:t xml:space="preserve">An automated lead-generation &amp; job-application pipeline</w:t>
-      </w:r>
-      <w:r>
-        <w:t xml:space="preserve"> </w:t>
-      </w:r>
-      <w:r>
-        <w:t xml:space="preserve">(Python, OpenStreetMap, local LLM classification) — national-scale business intelligence feeding a postcard-website outreach product.</w:t>
+        <w:t xml:space="preserve">A dedicated intelligence node with collectors across open-source intelligence, news, geopolitical</w:t>
+      </w:r>
+      <w:r>
+        <w:t xml:space="preserve"> </w:t>
+      </w:r>
+      <w:r>
+        <w:t xml:space="preserve">signal, market data and careers.</w:t>
+      </w:r>
+    </w:p>
+    <w:p>
+      <w:pPr>
+        <w:pStyle w:val="Compact"/>
+        <w:numPr>
+          <w:ilvl w:val="0"/>
+          <w:numId w:val="1002"/>
+        </w:numPr>
+      </w:pPr>
+      <w:r>
+        <w:t xml:space="preserve">Agents run as Claude Code sessions — director, scout, builder, reviewer, archivist — under a</w:t>
+      </w:r>
+      <w:r>
+        <w:t xml:space="preserve"> </w:t>
+      </w:r>
+      <w:r>
+        <w:t xml:space="preserve">deterministic supervisor that probes every node every sixty seconds and restarts what has failed.</w:t>
+      </w:r>
+      <w:r>
+        <w:t xml:space="preserve"> </w:t>
+      </w:r>
+      <w:r>
+        <w:t xml:space="preserve">One rule throughout:</w:t>
+      </w:r>
+      <w:r>
+        <w:t xml:space="preserve"> </w:t>
+      </w:r>
+      <w:r>
+        <w:rPr>
+          <w:b/>
+          <w:bCs/>
+        </w:rPr>
+        <w:t xml:space="preserve">no agent may mark its own work complete.</w:t>
+      </w:r>
+    </w:p>
+    <w:p>
+      <w:pPr>
+        <w:pStyle w:val="FirstParagraph"/>
+      </w:pPr>
+      <w:r>
+        <w:rPr>
+          <w:b/>
+          <w:bCs/>
+        </w:rPr>
+        <w:t xml:space="preserve">AI Declaration System — academic transparency tooling</w:t>
+      </w:r>
+    </w:p>
+    <w:p>
+      <w:pPr>
+        <w:pStyle w:val="Compact"/>
+        <w:numPr>
+          <w:ilvl w:val="0"/>
+          <w:numId w:val="1003"/>
+        </w:numPr>
+      </w:pPr>
+      <w:r>
+        <w:t xml:space="preserve">Built in Claude Code to govern my own academic AI use: logs how AI was involved in a piece of work</w:t>
+      </w:r>
+      <w:r>
+        <w:t xml:space="preserve"> </w:t>
+      </w:r>
+      <w:r>
+        <w:t xml:space="preserve">and generates a declaration page for the front of the submitted essay. Designed to sit inside</w:t>
+      </w:r>
+      <w:r>
+        <w:t xml:space="preserve"> </w:t>
+      </w:r>
+      <w:r>
+        <w:t xml:space="preserve">Loughborough’s AI-use guidelines.</w:t>
+      </w:r>
+    </w:p>
+    <w:p>
+      <w:pPr>
+        <w:pStyle w:val="FirstParagraph"/>
+      </w:pPr>
+      <w:r>
+        <w:rPr>
+          <w:b/>
+          <w:bCs/>
+        </w:rPr>
+        <w:t xml:space="preserve">KAM — a</w:t>
+      </w:r>
+      <w:r>
+        <w:rPr>
+          <w:b/>
+          <w:bCs/>
+        </w:rPr>
+        <w:t xml:space="preserve"> </w:t>
+      </w:r>
+      <w:r>
+        <w:rPr>
+          <w:b/>
+          <w:bCs/>
+        </w:rPr>
+        <w:t xml:space="preserve">“human operating system”</w:t>
+      </w:r>
+      <w:r>
+        <w:rPr>
+          <w:b/>
+          <w:bCs/>
+        </w:rPr>
+        <w:t xml:space="preserve"> </w:t>
+      </w:r>
+      <w:r>
+        <w:rPr>
+          <w:b/>
+          <w:bCs/>
+        </w:rPr>
+        <w:t xml:space="preserve">(concept stage, pre-beta)</w:t>
+      </w:r>
+    </w:p>
+    <w:p>
+      <w:pPr>
+        <w:pStyle w:val="Compact"/>
+        <w:numPr>
+          <w:ilvl w:val="0"/>
+          <w:numId w:val="1004"/>
+        </w:numPr>
+      </w:pPr>
+      <w:r>
+        <w:t xml:space="preserve">Around twenty-five modules behind a central hub, including WORLD, a layered model of the planet</w:t>
+      </w:r>
+      <w:r>
+        <w:t xml:space="preserve"> </w:t>
+      </w:r>
+      <w:r>
+        <w:t xml:space="preserve">with a temporal slider through migration, empire and war, and a Council that convenes strategic,</w:t>
+      </w:r>
+      <w:r>
+        <w:t xml:space="preserve"> </w:t>
+      </w:r>
+      <w:r>
+        <w:t xml:space="preserve">economic, legal and ethical perspectives on a decision while the user remains the one who decides.</w:t>
+      </w:r>
+    </w:p>
+    <w:p>
+      <w:pPr>
+        <w:pStyle w:val="Compact"/>
+        <w:numPr>
+          <w:ilvl w:val="0"/>
+          <w:numId w:val="1004"/>
+        </w:numPr>
+      </w:pPr>
+      <w:r>
+        <w:t xml:space="preserve">Interfaces and navigation built; intelligence and data layers still largely scaffolding. Hosts my</w:t>
+      </w:r>
+      <w:r>
+        <w:t xml:space="preserve"> </w:t>
+      </w:r>
+      <w:r>
+        <w:t xml:space="preserve">dissertation’s predictive model.</w:t>
+      </w:r>
+    </w:p>
+    <w:p>
+      <w:pPr>
+        <w:pStyle w:val="FirstParagraph"/>
+      </w:pPr>
+      <w:r>
+        <w:rPr>
+          <w:b/>
+          <w:bCs/>
+        </w:rPr>
+        <w:t xml:space="preserve">Future Warfare — a civilian security curriculum inside KAM</w:t>
+      </w:r>
+    </w:p>
+    <w:p>
+      <w:pPr>
+        <w:pStyle w:val="Compact"/>
+        <w:numPr>
+          <w:ilvl w:val="0"/>
+          <w:numId w:val="1005"/>
+        </w:numPr>
+      </w:pPr>
+      <w:r>
+        <w:t xml:space="preserve">Six modules (cyber security, AI defence, autonomous systems, space, drones, pilot training) on the</w:t>
+      </w:r>
+      <w:r>
+        <w:t xml:space="preserve"> </w:t>
+      </w:r>
+      <w:r>
+        <w:t xml:space="preserve">premise that the modern conflict surface reaches civilians first. Tested on myself: paired red-team</w:t>
+      </w:r>
+      <w:r>
+        <w:t xml:space="preserve"> </w:t>
+      </w:r>
+      <w:r>
+        <w:t xml:space="preserve">and blue-team drills against my own infrastructure, including brute-force attempts on my own SSH.</w:t>
+      </w:r>
+    </w:p>
+    <w:p>
+      <w:pPr>
+        <w:pStyle w:val="FirstParagraph"/>
+      </w:pPr>
+      <w:r>
+        <w:rPr>
+          <w:b/>
+          <w:bCs/>
+        </w:rPr>
+        <w:t xml:space="preserve">Polymarket War Room — paper-traded market engine</w:t>
+      </w:r>
+    </w:p>
+    <w:p>
+      <w:pPr>
+        <w:pStyle w:val="Compact"/>
+        <w:numPr>
+          <w:ilvl w:val="0"/>
+          <w:numId w:val="1006"/>
+        </w:numPr>
+      </w:pPr>
+      <w:r>
+        <w:t xml:space="preserve">Three bot configurations on five-minute crypto markets. Best: $50 → $106.56 (+113%) over 289</w:t>
+      </w:r>
+      <w:r>
+        <w:t xml:space="preserve"> </w:t>
+      </w:r>
+      <w:r>
+        <w:t xml:space="preserve">trades at a 64.7% win rate — paper-traded, no capital at risk. I then wrote the assessment showing</w:t>
+      </w:r>
+      <w:r>
+        <w:t xml:space="preserve"> </w:t>
+      </w:r>
+      <w:r>
+        <w:t xml:space="preserve">the result does not transfer to other market classes, and kept only the portable finding.</w:t>
       </w:r>
     </w:p>
     <w:p>
@@ -313,7 +502,21 @@
           <w:i/>
           <w:iCs/>
         </w:rPr>
-        <w:t xml:space="preserve">Stack across the estate: React 19 / TypeScript / Three.js · Python / FastAPI · Ollama, llama.cpp, local LLMs · multi-agent orchestration · RAG · Tailscale-meshed distributed systems · systemd.</w:t>
+        <w:t xml:space="preserve">Method across all of it: instrument before theorising, verify before trusting, let the measurement</w:t>
+      </w:r>
+      <w:r>
+        <w:rPr>
+          <w:i/>
+          <w:iCs/>
+        </w:rPr>
+        <w:t xml:space="preserve"> </w:t>
+      </w:r>
+      <w:r>
+        <w:rPr>
+          <w:i/>
+          <w:iCs/>
+        </w:rPr>
+        <w:t xml:space="preserve">close the argument.</w:t>
       </w:r>
     </w:p>
     <w:p>
@@ -342,13 +545,164 @@
           <w:b/>
           <w:bCs/>
         </w:rPr>
-        <w:t xml:space="preserve">Loughborough University — BA History &amp; Politics</w:t>
-      </w:r>
-      <w:r>
-        <w:t xml:space="preserve"> </w:t>
-      </w:r>
-      <w:r>
-        <w:t xml:space="preserve">·</w:t>
+        <w:t xml:space="preserve">Loughborough University — BA (Hons) History &amp; Politics</w:t>
+      </w:r>
+      <w:r>
+        <w:t xml:space="preserve"> </w:t>
+      </w:r>
+      <w:r>
+        <w:t xml:space="preserve">· 2024 – 2027, final year</w:t>
+      </w:r>
+    </w:p>
+    <w:p>
+      <w:pPr>
+        <w:pStyle w:val="Compact"/>
+        <w:numPr>
+          <w:ilvl w:val="0"/>
+          <w:numId w:val="1007"/>
+        </w:numPr>
+      </w:pPr>
+      <w:r>
+        <w:t xml:space="preserve">Selected marks: African States and Nations</w:t>
+      </w:r>
+      <w:r>
+        <w:t xml:space="preserve"> </w:t>
+      </w:r>
+      <w:r>
+        <w:rPr>
+          <w:b/>
+          <w:bCs/>
+        </w:rPr>
+        <w:t xml:space="preserve">70</w:t>
+      </w:r>
+      <w:r>
+        <w:t xml:space="preserve"> </w:t>
+      </w:r>
+      <w:r>
+        <w:t xml:space="preserve">· Politics of Development</w:t>
+      </w:r>
+      <w:r>
+        <w:t xml:space="preserve"> </w:t>
+      </w:r>
+      <w:r>
+        <w:rPr>
+          <w:b/>
+          <w:bCs/>
+        </w:rPr>
+        <w:t xml:space="preserve">66</w:t>
+      </w:r>
+      <w:r>
+        <w:t xml:space="preserve"> </w:t>
+      </w:r>
+      <w:r>
+        <w:t xml:space="preserve">· International</w:t>
+      </w:r>
+      <w:r>
+        <w:t xml:space="preserve"> </w:t>
+      </w:r>
+      <w:r>
+        <w:t xml:space="preserve">Political Theory</w:t>
+      </w:r>
+      <w:r>
+        <w:t xml:space="preserve"> </w:t>
+      </w:r>
+      <w:r>
+        <w:rPr>
+          <w:b/>
+          <w:bCs/>
+        </w:rPr>
+        <w:t xml:space="preserve">66</w:t>
+      </w:r>
+      <w:r>
+        <w:t xml:space="preserve"> </w:t>
+      </w:r>
+      <w:r>
+        <w:t xml:space="preserve">· British India, 1857–1947</w:t>
+      </w:r>
+      <w:r>
+        <w:t xml:space="preserve"> </w:t>
+      </w:r>
+      <w:r>
+        <w:rPr>
+          <w:b/>
+          <w:bCs/>
+        </w:rPr>
+        <w:t xml:space="preserve">65</w:t>
+      </w:r>
+      <w:r>
+        <w:t xml:space="preserve"> </w:t>
+      </w:r>
+      <w:r>
+        <w:t xml:space="preserve">· The Making and Unmaking of the World</w:t>
+      </w:r>
+      <w:r>
+        <w:t xml:space="preserve"> </w:t>
+      </w:r>
+      <w:r>
+        <w:t xml:space="preserve">Order</w:t>
+      </w:r>
+      <w:r>
+        <w:t xml:space="preserve"> </w:t>
+      </w:r>
+      <w:r>
+        <w:rPr>
+          <w:b/>
+          <w:bCs/>
+        </w:rPr>
+        <w:t xml:space="preserve">65</w:t>
+      </w:r>
+      <w:r>
+        <w:t xml:space="preserve"> </w:t>
+      </w:r>
+      <w:r>
+        <w:t xml:space="preserve">· Theories and Methods in Political Research</w:t>
+      </w:r>
+      <w:r>
+        <w:t xml:space="preserve"> </w:t>
+      </w:r>
+      <w:r>
+        <w:rPr>
+          <w:b/>
+          <w:bCs/>
+        </w:rPr>
+        <w:t xml:space="preserve">65</w:t>
+      </w:r>
+      <w:r>
+        <w:t xml:space="preserve">.</w:t>
+      </w:r>
+    </w:p>
+    <w:p>
+      <w:pPr>
+        <w:pStyle w:val="Compact"/>
+        <w:numPr>
+          <w:ilvl w:val="0"/>
+          <w:numId w:val="1007"/>
+        </w:numPr>
+      </w:pPr>
+      <w:r>
+        <w:t xml:space="preserve">Final-year modules: Dissertation · The Soviet Security State · After Empire: South Asia ·</w:t>
+      </w:r>
+      <w:r>
+        <w:t xml:space="preserve"> </w:t>
+      </w:r>
+      <w:r>
+        <w:t xml:space="preserve">International Conflict Management · French.</w:t>
+      </w:r>
+    </w:p>
+    <w:p>
+      <w:pPr>
+        <w:pStyle w:val="Compact"/>
+        <w:numPr>
+          <w:ilvl w:val="0"/>
+          <w:numId w:val="1007"/>
+        </w:numPr>
+      </w:pPr>
+      <w:r>
+        <w:rPr>
+          <w:b/>
+          <w:bCs/>
+        </w:rPr>
+        <w:t xml:space="preserve">Dissertation (in progress):</w:t>
       </w:r>
       <w:r>
         <w:t xml:space="preserve"> </w:t>
@@ -358,107 +712,79 @@
           <w:i/>
           <w:iCs/>
         </w:rPr>
-        <w:t xml:space="preserve">2024 – 2027 (final year, Sept 2026)</w:t>
-      </w:r>
-      <w:r>
-        <w:t xml:space="preserve"> </w:t>
-      </w:r>
-      <w:r>
-        <w:t xml:space="preserve">First-class module work: African States &amp; Nations</w:t>
-      </w:r>
-      <w:r>
-        <w:t xml:space="preserve"> </w:t>
-      </w:r>
-      <w:r>
-        <w:rPr>
-          <w:b/>
-          <w:bCs/>
-        </w:rPr>
-        <w:t xml:space="preserve">70</w:t>
-      </w:r>
-      <w:r>
-        <w:t xml:space="preserve">, Politics of Development</w:t>
-      </w:r>
-      <w:r>
-        <w:t xml:space="preserve"> </w:t>
-      </w:r>
-      <w:r>
-        <w:rPr>
-          <w:b/>
-          <w:bCs/>
-        </w:rPr>
-        <w:t xml:space="preserve">66</w:t>
-      </w:r>
-      <w:r>
-        <w:t xml:space="preserve">, International Political Theory</w:t>
-      </w:r>
-      <w:r>
-        <w:t xml:space="preserve"> </w:t>
-      </w:r>
-      <w:r>
-        <w:rPr>
-          <w:b/>
-          <w:bCs/>
-        </w:rPr>
-        <w:t xml:space="preserve">66</w:t>
-      </w:r>
-      <w:r>
-        <w:t xml:space="preserve">, The Making &amp; Unmaking of the World Order</w:t>
-      </w:r>
-      <w:r>
-        <w:t xml:space="preserve"> </w:t>
-      </w:r>
-      <w:r>
-        <w:rPr>
-          <w:b/>
-          <w:bCs/>
-        </w:rPr>
-        <w:t xml:space="preserve">65</w:t>
-      </w:r>
-      <w:r>
-        <w:t xml:space="preserve">, Theories &amp; Methods in Political Research</w:t>
-      </w:r>
-      <w:r>
-        <w:t xml:space="preserve"> </w:t>
-      </w:r>
-      <w:r>
-        <w:rPr>
-          <w:b/>
-          <w:bCs/>
-        </w:rPr>
-        <w:t xml:space="preserve">65</w:t>
-      </w:r>
-      <w:r>
-        <w:t xml:space="preserve">.</w:t>
-      </w:r>
-      <w:r>
-        <w:t xml:space="preserve"> </w:t>
-      </w:r>
-      <w:r>
-        <w:rPr>
-          <w:b/>
-          <w:bCs/>
-        </w:rPr>
-        <w:t xml:space="preserve">Dissertation (in progress):</w:t>
-      </w:r>
-      <w:r>
-        <w:t xml:space="preserve"> </w:t>
-      </w:r>
-      <w:r>
-        <w:t xml:space="preserve">an AI-assisted platform for civilian geopolitical &amp; security analysis in peace and conflict —</w:t>
-      </w:r>
-      <w:r>
-        <w:t xml:space="preserve"> </w:t>
-      </w:r>
-      <w:r>
-        <w:rPr>
-          <w:i/>
-          <w:iCs/>
-        </w:rPr>
-        <w:t xml:space="preserve">KAM built as the dissertation’s analytical instrument</w:t>
-      </w:r>
-      <w:r>
-        <w:t xml:space="preserve">, bridging the software and the scholarship.</w:t>
+        <w:t xml:space="preserve">Great Power War as a Process</w:t>
+      </w:r>
+      <w:r>
+        <w:t xml:space="preserve"> </w:t>
+      </w:r>
+      <w:r>
+        <w:t xml:space="preserve">— major conflict read as a long</w:t>
+      </w:r>
+      <w:r>
+        <w:t xml:space="preserve"> </w:t>
+      </w:r>
+      <w:r>
+        <w:t xml:space="preserve">structural process rather than a dated event, tested with a predictive model built for civilian</w:t>
+      </w:r>
+      <w:r>
+        <w:t xml:space="preserve"> </w:t>
+      </w:r>
+      <w:r>
+        <w:t xml:space="preserve">geopolitical and security analysis.</w:t>
+      </w:r>
+    </w:p>
+    <w:p>
+      <w:pPr>
+        <w:pStyle w:val="Compact"/>
+        <w:numPr>
+          <w:ilvl w:val="0"/>
+          <w:numId w:val="1007"/>
+        </w:numPr>
+      </w:pPr>
+      <w:r>
+        <w:t xml:space="preserve">Declared AI use from the start: for British India I used Claude to build a reading guide, wrote the</w:t>
+      </w:r>
+      <w:r>
+        <w:t xml:space="preserve"> </w:t>
+      </w:r>
+      <w:r>
+        <w:t xml:space="preserve">essay entirely myself, and stated the AI involvement on the front page.</w:t>
+      </w:r>
+    </w:p>
+    <w:p>
+      <w:pPr>
+        <w:pStyle w:val="Compact"/>
+        <w:numPr>
+          <w:ilvl w:val="0"/>
+          <w:numId w:val="1007"/>
+        </w:numPr>
+      </w:pPr>
+      <w:r>
+        <w:t xml:space="preserve">Planning a one-year taught master’s in International Security, 2027–28.</w:t>
+      </w:r>
+    </w:p>
+    <w:p>
+      <w:pPr>
+        <w:pStyle w:val="FirstParagraph"/>
+      </w:pPr>
+      <w:r>
+        <w:rPr>
+          <w:b/>
+          <w:bCs/>
+        </w:rPr>
+        <w:t xml:space="preserve">Anthropic Academy</w:t>
+      </w:r>
+      <w:r>
+        <w:t xml:space="preserve"> </w:t>
+      </w:r>
+      <w:r>
+        <w:t xml:space="preserve">· AI Fluency for Students · AI Fluency: Capabilities and Limits · AI Fluency:</w:t>
+      </w:r>
+      <w:r>
+        <w:t xml:space="preserve"> </w:t>
+      </w:r>
+      <w:r>
+        <w:t xml:space="preserve">Framework and Foundations (all completed)</w:t>
       </w:r>
     </w:p>
     <w:p>
@@ -470,29 +796,19 @@
           <w:b/>
           <w:bCs/>
         </w:rPr>
-        <w:t xml:space="preserve">Harlington Sixth Form, Luton</w:t>
-      </w:r>
-      <w:r>
-        <w:t xml:space="preserve"> </w:t>
-      </w:r>
-      <w:r>
-        <w:t xml:space="preserve">· A-Levels: Psychology (B), Criminology (B), Media Studies (B) ·</w:t>
-      </w:r>
-      <w:r>
-        <w:t xml:space="preserve"> </w:t>
-      </w:r>
-      <w:r>
-        <w:rPr>
-          <w:b/>
-          <w:bCs/>
-        </w:rPr>
-        <w:t xml:space="preserve">Head Student</w:t>
-      </w:r>
-      <w:r>
-        <w:t xml:space="preserve"> </w:t>
-      </w:r>
-      <w:r>
-        <w:t xml:space="preserve">of Sixth Form &amp; Upper School.</w:t>
+        <w:t xml:space="preserve">Harlington Upper School &amp; Sixth Form, Central Bedfordshire</w:t>
+      </w:r>
+      <w:r>
+        <w:t xml:space="preserve"> </w:t>
+      </w:r>
+      <w:r>
+        <w:t xml:space="preserve">· A-Levels: Psychology (B) ·</w:t>
+      </w:r>
+      <w:r>
+        <w:t xml:space="preserve"> </w:t>
+      </w:r>
+      <w:r>
+        <w:t xml:space="preserve">Criminology (B) · Media Studies (B) · 9 GCSEs</w:t>
       </w:r>
     </w:p>
     <w:p>
@@ -503,13 +819,13 @@
       </w:r>
     </w:p>
     <w:bookmarkEnd w:id="11"/>
-    <w:bookmarkStart w:id="12" w:name="experience"/>
+    <w:bookmarkStart w:id="12" w:name="leadership"/>
     <w:p>
       <w:pPr>
         <w:pStyle w:val="Heading2"/>
       </w:pPr>
       <w:r>
-        <w:t xml:space="preserve">EXPERIENCE</w:t>
+        <w:t xml:space="preserve">LEADERSHIP</w:t>
       </w:r>
     </w:p>
     <w:p>
@@ -521,88 +837,91 @@
           <w:b/>
           <w:bCs/>
         </w:rPr>
-        <w:t xml:space="preserve">Buy Sell and Loan (Questar Ltd), Luton — Team Member</w:t>
-      </w:r>
-      <w:r>
-        <w:t xml:space="preserve"> </w:t>
-      </w:r>
-      <w:r>
-        <w:t xml:space="preserve">·</w:t>
-      </w:r>
-      <w:r>
-        <w:t xml:space="preserve"> </w:t>
-      </w:r>
-      <w:r>
-        <w:rPr>
-          <w:i/>
-          <w:iCs/>
-        </w:rPr>
-        <w:t xml:space="preserve">2024 – present</w:t>
-      </w:r>
-      <w:r>
-        <w:t xml:space="preserve"> </w:t>
-      </w:r>
-      <w:r>
-        <w:t xml:space="preserve">Regulated retail dealing in high-value electronics, jewellery and luxury goods. High-value item assessment and valuation; regulatory-compliant record-keeping; cash handling; trust-based repeat-customer relationships; independent operation across the store.</w:t>
-      </w:r>
-    </w:p>
-    <w:p>
-      <w:pPr>
-        <w:pStyle w:val="BodyText"/>
-      </w:pPr>
-      <w:r>
-        <w:rPr>
-          <w:b/>
-          <w:bCs/>
-        </w:rPr>
-        <w:t xml:space="preserve">Pret A Manger, Luton Airport (airside) — Team Member</w:t>
-      </w:r>
-      <w:r>
-        <w:t xml:space="preserve"> </w:t>
-      </w:r>
-      <w:r>
-        <w:t xml:space="preserve">·</w:t>
-      </w:r>
-      <w:r>
-        <w:t xml:space="preserve"> </w:t>
-      </w:r>
-      <w:r>
-        <w:rPr>
-          <w:i/>
-          <w:iCs/>
-        </w:rPr>
-        <w:t xml:space="preserve">2022 – 2024</w:t>
-      </w:r>
-      <w:r>
-        <w:t xml:space="preserve"> </w:t>
-      </w:r>
-      <w:r>
-        <w:t xml:space="preserve">One of Pret’s highest-footfall UK sites. Fast, accurate high-volume service to an international clientele;</w:t>
-      </w:r>
-      <w:r>
-        <w:t xml:space="preserve"> </w:t>
-      </w:r>
-      <w:r>
-        <w:rPr>
-          <w:b/>
-          <w:bCs/>
-        </w:rPr>
-        <w:t xml:space="preserve">self-initiated barista training above grade</w:t>
-      </w:r>
-      <w:r>
-        <w:t xml:space="preserve">; ran the kiosk independently (sales, stock/FIFO, hygiene, closing) with no managerial assistance.</w:t>
-      </w:r>
-    </w:p>
-    <w:p>
-      <w:pPr>
-        <w:pStyle w:val="BodyText"/>
-      </w:pPr>
-      <w:r>
-        <w:rPr>
-          <w:i/>
-          <w:iCs/>
-        </w:rPr>
-        <w:t xml:space="preserve">~5 years of continuous customer-facing work alongside full-time education.</w:t>
+        <w:t xml:space="preserve">Head Student, Sixth Form and Upper School — Harlington</w:t>
+      </w:r>
+      <w:r>
+        <w:t xml:space="preserve"> </w:t>
+      </w:r>
+      <w:r>
+        <w:t xml:space="preserve">· 2023 – 2024</w:t>
+      </w:r>
+    </w:p>
+    <w:p>
+      <w:pPr>
+        <w:pStyle w:val="Compact"/>
+        <w:numPr>
+          <w:ilvl w:val="0"/>
+          <w:numId w:val="1008"/>
+        </w:numPr>
+      </w:pPr>
+      <w:r>
+        <w:t xml:space="preserve">Elected by staff to lead the student leadership team; the link between students and senior staff.</w:t>
+      </w:r>
+    </w:p>
+    <w:p>
+      <w:pPr>
+        <w:pStyle w:val="Compact"/>
+        <w:numPr>
+          <w:ilvl w:val="0"/>
+          <w:numId w:val="1008"/>
+        </w:numPr>
+      </w:pPr>
+      <w:r>
+        <w:t xml:space="preserve">Planned and delivered the school’s major events across the year, including prom and leavers’ day.</w:t>
+      </w:r>
+    </w:p>
+    <w:p>
+      <w:pPr>
+        <w:pStyle w:val="Compact"/>
+        <w:numPr>
+          <w:ilvl w:val="0"/>
+          <w:numId w:val="1008"/>
+        </w:numPr>
+      </w:pPr>
+      <w:r>
+        <w:t xml:space="preserve">Represented the school publicly: open-day speeches to prospective students, a community residents’</w:t>
+      </w:r>
+      <w:r>
+        <w:t xml:space="preserve"> </w:t>
+      </w:r>
+      <w:r>
+        <w:t xml:space="preserve">tea party I hosted, and visits from politicians.</w:t>
+      </w:r>
+    </w:p>
+    <w:p>
+      <w:pPr>
+        <w:pStyle w:val="Compact"/>
+        <w:numPr>
+          <w:ilvl w:val="0"/>
+          <w:numId w:val="1008"/>
+        </w:numPr>
+      </w:pPr>
+      <w:r>
+        <w:t xml:space="preserve">Organised and fronted a Movember fundraiser end to end, raising</w:t>
+      </w:r>
+      <w:r>
+        <w:t xml:space="preserve"> </w:t>
+      </w:r>
+      <w:r>
+        <w:rPr>
+          <w:b/>
+          <w:bCs/>
+        </w:rPr>
+        <w:t xml:space="preserve">£750 — the most any single</w:t>
+      </w:r>
+      <w:r>
+        <w:rPr>
+          <w:b/>
+          <w:bCs/>
+        </w:rPr>
+        <w:t xml:space="preserve"> </w:t>
+      </w:r>
+      <w:r>
+        <w:rPr>
+          <w:b/>
+          <w:bCs/>
+        </w:rPr>
+        <w:t xml:space="preserve">student has raised for the school.</w:t>
       </w:r>
     </w:p>
     <w:p>
@@ -613,13 +932,13 @@
       </w:r>
     </w:p>
     <w:bookmarkEnd w:id="12"/>
-    <w:bookmarkStart w:id="13" w:name="skills"/>
+    <w:bookmarkStart w:id="13" w:name="employment"/>
     <w:p>
       <w:pPr>
         <w:pStyle w:val="Heading2"/>
       </w:pPr>
       <w:r>
-        <w:t xml:space="preserve">SKILLS</w:t>
+        <w:t xml:space="preserve">EMPLOYMENT</w:t>
       </w:r>
     </w:p>
     <w:p>
@@ -631,45 +950,85 @@
           <w:b/>
           <w:bCs/>
         </w:rPr>
-        <w:t xml:space="preserve">AI / technical:</w:t>
-      </w:r>
-      <w:r>
-        <w:t xml:space="preserve"> </w:t>
-      </w:r>
-      <w:r>
-        <w:t xml:space="preserve">Claude &amp; Claude Code (primary) · multi-agent design &amp; orchestration · prompt &amp; context engineering · retrieval-augmented generation (hybrid, abstention) · local-model deployment (Ollama, llama.cpp) · Python (AI-assisted development) · React 19 + Vite · Linux CLI &amp; networking · calibration/eval discipline (CLV, Brier).</w:t>
-      </w:r>
-      <w:r>
-        <w:t xml:space="preserve"> </w:t>
-      </w:r>
-      <w:r>
-        <w:rPr>
-          <w:b/>
-          <w:bCs/>
-        </w:rPr>
-        <w:t xml:space="preserve">Analytical / research:</w:t>
-      </w:r>
-      <w:r>
-        <w:t xml:space="preserve"> </w:t>
-      </w:r>
-      <w:r>
-        <w:t xml:space="preserve">OSINT methodology (multi-source verification, structured synthesis) · research design · written analysis to deadline · university-level political analysis.</w:t>
-      </w:r>
-      <w:r>
-        <w:t xml:space="preserve"> </w:t>
-      </w:r>
-      <w:r>
-        <w:rPr>
-          <w:b/>
-          <w:bCs/>
-        </w:rPr>
-        <w:t xml:space="preserve">Operational:</w:t>
-      </w:r>
-      <w:r>
-        <w:t xml:space="preserve"> </w:t>
-      </w:r>
-      <w:r>
-        <w:t xml:space="preserve">regulated cash handling &amp; compliance · high-volume customer service · reliability under pressure.</w:t>
+        <w:t xml:space="preserve">Team Member — Bargain Booze, Loughborough</w:t>
+      </w:r>
+      <w:r>
+        <w:t xml:space="preserve"> </w:t>
+      </w:r>
+      <w:r>
+        <w:t xml:space="preserve">· 2026 – present</w:t>
+      </w:r>
+    </w:p>
+    <w:p>
+      <w:pPr>
+        <w:pStyle w:val="BodyText"/>
+      </w:pPr>
+      <w:r>
+        <w:t xml:space="preserve">Licensed retail alongside my final year: customer service, restocking and store presentation.</w:t>
+      </w:r>
+    </w:p>
+    <w:p>
+      <w:pPr>
+        <w:pStyle w:val="BodyText"/>
+      </w:pPr>
+      <w:r>
+        <w:rPr>
+          <w:b/>
+          <w:bCs/>
+        </w:rPr>
+        <w:t xml:space="preserve">Team Member — Buy Sell and Loan (Questar Ltd), Luton</w:t>
+      </w:r>
+      <w:r>
+        <w:t xml:space="preserve"> </w:t>
+      </w:r>
+      <w:r>
+        <w:t xml:space="preserve">· 2024 – present</w:t>
+      </w:r>
+    </w:p>
+    <w:p>
+      <w:pPr>
+        <w:pStyle w:val="BodyText"/>
+      </w:pPr>
+      <w:r>
+        <w:t xml:space="preserve">Regulated retail in high-value electronics, jewellery and luxury goods: item valuation, compliant</w:t>
+      </w:r>
+      <w:r>
+        <w:t xml:space="preserve"> </w:t>
+      </w:r>
+      <w:r>
+        <w:t xml:space="preserve">record-keeping, cash handling and independent operation across the store.</w:t>
+      </w:r>
+    </w:p>
+    <w:p>
+      <w:pPr>
+        <w:pStyle w:val="BodyText"/>
+      </w:pPr>
+      <w:r>
+        <w:rPr>
+          <w:b/>
+          <w:bCs/>
+        </w:rPr>
+        <w:t xml:space="preserve">Team Member — Pret A Manger, Luton Airport (airside)</w:t>
+      </w:r>
+      <w:r>
+        <w:t xml:space="preserve"> </w:t>
+      </w:r>
+      <w:r>
+        <w:t xml:space="preserve">· 2022 – 2024</w:t>
+      </w:r>
+    </w:p>
+    <w:p>
+      <w:pPr>
+        <w:pStyle w:val="BodyText"/>
+      </w:pPr>
+      <w:r>
+        <w:t xml:space="preserve">One of Pret’s highest-footfall UK sites: high-volume service under time pressure, barista training</w:t>
+      </w:r>
+      <w:r>
+        <w:t xml:space="preserve"> </w:t>
+      </w:r>
+      <w:r>
+        <w:t xml:space="preserve">taken on above grade, and the kiosk run independently through to closing.</w:t>
       </w:r>
     </w:p>
     <w:p>
@@ -680,12 +1039,100 @@
       </w:r>
     </w:p>
     <w:bookmarkEnd w:id="13"/>
-    <w:bookmarkStart w:id="14" w:name="interests"/>
+    <w:bookmarkStart w:id="14" w:name="skills"/>
     <w:p>
       <w:pPr>
         <w:pStyle w:val="Heading2"/>
       </w:pPr>
       <w:r>
+        <w:t xml:space="preserve">SKILLS</w:t>
+      </w:r>
+    </w:p>
+    <w:p>
+      <w:pPr>
+        <w:pStyle w:val="FirstParagraph"/>
+      </w:pPr>
+      <w:r>
+        <w:rPr>
+          <w:b/>
+          <w:bCs/>
+        </w:rPr>
+        <w:t xml:space="preserve">AI / technical:</w:t>
+      </w:r>
+      <w:r>
+        <w:t xml:space="preserve"> </w:t>
+      </w:r>
+      <w:r>
+        <w:t xml:space="preserve">Claude and Claude Code · multi-agent orchestration · prompt and context</w:t>
+      </w:r>
+      <w:r>
+        <w:t xml:space="preserve"> </w:t>
+      </w:r>
+      <w:r>
+        <w:t xml:space="preserve">engineering · retrieval-augmented generation · Python and Java (AI-assisted) · evaluation and</w:t>
+      </w:r>
+      <w:r>
+        <w:t xml:space="preserve"> </w:t>
+      </w:r>
+      <w:r>
+        <w:t xml:space="preserve">self-test discipline · Linux, networking and self-hosted infrastructure.</w:t>
+      </w:r>
+    </w:p>
+    <w:p>
+      <w:pPr>
+        <w:pStyle w:val="BodyText"/>
+      </w:pPr>
+      <w:r>
+        <w:rPr>
+          <w:b/>
+          <w:bCs/>
+        </w:rPr>
+        <w:t xml:space="preserve">Research / analysis:</w:t>
+      </w:r>
+      <w:r>
+        <w:t xml:space="preserve"> </w:t>
+      </w:r>
+      <w:r>
+        <w:t xml:space="preserve">OSINT methodology and multi-source verification · research design ·</w:t>
+      </w:r>
+      <w:r>
+        <w:t xml:space="preserve"> </w:t>
+      </w:r>
+      <w:r>
+        <w:t xml:space="preserve">structured synthesis · written analysis to deadline.</w:t>
+      </w:r>
+    </w:p>
+    <w:p>
+      <w:pPr>
+        <w:pStyle w:val="BodyText"/>
+      </w:pPr>
+      <w:r>
+        <w:rPr>
+          <w:b/>
+          <w:bCs/>
+        </w:rPr>
+        <w:t xml:space="preserve">Languages:</w:t>
+      </w:r>
+      <w:r>
+        <w:t xml:space="preserve"> </w:t>
+      </w:r>
+      <w:r>
+        <w:t xml:space="preserve">English (native) · French (learning, final-year module — not yet working</w:t>
+      </w:r>
+      <w:r>
+        <w:t xml:space="preserve"> </w:t>
+      </w:r>
+      <w:r>
+        <w:t xml:space="preserve">proficiency)</w:t>
+      </w:r>
+    </w:p>
+    <w:bookmarkEnd w:id="14"/>
+    <w:bookmarkStart w:id="15" w:name="interests"/>
+    <w:p>
+      <w:pPr>
+        <w:pStyle w:val="Heading2"/>
+      </w:pPr>
+      <w:r>
         <w:t xml:space="preserve">INTERESTS</w:t>
       </w:r>
     </w:p>
@@ -694,11 +1141,23 @@
         <w:pStyle w:val="FirstParagraph"/>
       </w:pPr>
       <w:r>
-        <w:t xml:space="preserve">AI as a structural force in geopolitics · dual-use technology &amp; access asymmetry · the emerging agent economy · post-colonial political economy · the space between peace and war (dissertation terrain).</w:t>
-      </w:r>
-    </w:p>
-    <w:bookmarkEnd w:id="14"/>
+        <w:t xml:space="preserve">AI as a structural force in geopolitics · AI sovereignty and the UK’s position · dual-use technology</w:t>
+      </w:r>
+      <w:r>
+        <w:t xml:space="preserve"> </w:t>
+      </w:r>
+      <w:r>
+        <w:t xml:space="preserve">and access asymmetry · cybersecurity, intelligence and diplomacy · the Cold War · the space between</w:t>
+      </w:r>
+      <w:r>
+        <w:t xml:space="preserve"> </w:t>
+      </w:r>
+      <w:r>
+        <w:t xml:space="preserve">peace and war.</w:t>
+      </w:r>
+    </w:p>
     <w:bookmarkEnd w:id="15"/>
+    <w:bookmarkEnd w:id="16"/>
     <w:sectPr>
       <w:footnotePr>
         <w:numRestart w:val="eachSect"/>
@@ -916,6 +1375,27 @@
     <w:abstractNumId w:val="990"/>
   </w:num>
   <w:num w:numId="1001">
+    <w:abstractNumId w:val="991"/>
+  </w:num>
+  <w:num w:numId="1002">
+    <w:abstractNumId w:val="991"/>
+  </w:num>
+  <w:num w:numId="1003">
+    <w:abstractNumId w:val="991"/>
+  </w:num>
+  <w:num w:numId="1004">
+    <w:abstractNumId w:val="991"/>
+  </w:num>
+  <w:num w:numId="1005">
+    <w:abstractNumId w:val="991"/>
+  </w:num>
+  <w:num w:numId="1006">
+    <w:abstractNumId w:val="991"/>
+  </w:num>
+  <w:num w:numId="1007">
+    <w:abstractNumId w:val="991"/>
+  </w:num>
+  <w:num w:numId="1008">
     <w:abstractNumId w:val="991"/>
   </w:num>
 </w:numbering>

</xml_diff>

<commit_message>
Sync: preview is canon (auto)
Co-Authored-By: Claude Opus 5.5 <noreply@anthropic.com>
</commit_message>
<xml_diff>
--- a/cv/Karam-Binning-CV.docx
+++ b/cv/Karam-Binning-CV.docx
@@ -2,12 +2,26 @@
 <file path=word/document.xml><?xml version="1.0" encoding="utf-8"?>
 <w:document xmlns:w="http://schemas.openxmlformats.org/wordprocessingml/2006/main" xmlns:m="http://schemas.openxmlformats.org/officeDocument/2006/math" xmlns:r="http://schemas.openxmlformats.org/officeDocument/2006/relationships" xmlns:o="urn:schemas-microsoft-com:office:office" xmlns:v="urn:schemas-microsoft-com:vml" xmlns:w10="urn:schemas-microsoft-com:office:word" xmlns:a="http://schemas.openxmlformats.org/drawingml/2006/main" xmlns:pic="http://schemas.openxmlformats.org/drawingml/2006/picture" xmlns:wp="http://schemas.openxmlformats.org/drawingml/2006/wordprocessingDrawing">
   <w:body>
-    <w:bookmarkStart w:id="16" w:name="karam-binning"/>
+    <w:p>
+      <w:pPr>
+        <w:pStyle w:val="Title"/>
+      </w:pPr>
+      <w:r>
+        <w:rPr>
+          <w:lang w:val="en"/>
+        </w:rPr>
+        <w:t xml:space="preserve">Karam Binning — CV</w:t>
+      </w:r>
+    </w:p>
+    <w:bookmarkStart w:id="15" w:name="karam-binning"/>
     <w:p>
       <w:pPr>
         <w:pStyle w:val="Heading1"/>
       </w:pPr>
       <w:r>
+        <w:rPr>
+          <w:lang w:val="en"/>
+        </w:rPr>
         <w:t xml:space="preserve">KARAM BINNING</w:t>
       </w:r>
     </w:p>
@@ -15,150 +29,127 @@
       <w:pPr>
         <w:pStyle w:val="FirstParagraph"/>
       </w:pPr>
+      <w:r>
+        <w:rPr>
+          <w:lang w:val="en"/>
+        </w:rPr>
+        <w:t xml:space="preserve">Final-year BA History &amp; Politics, Loughborough University · builds working AI systems with Claude</w:t>
+      </w:r>
+    </w:p>
+    <w:p>
+      <w:pPr>
+        <w:pStyle w:val="BodyText"/>
+      </w:pPr>
+      <w:r>
+        <w:rPr>
+          <w:lang w:val="en"/>
+        </w:rPr>
+        <w:t xml:space="preserve">K.S.Binning1-24@student.lboro.ac.uk · 07951 882002 ·</w:t>
+      </w:r>
+      <w:r>
+        <w:rPr>
+          <w:lang w:val="en"/>
+        </w:rPr>
+        <w:t xml:space="preserve"> </w:t>
+      </w:r>
+      <w:hyperlink r:id="rId9">
+        <w:r>
+          <w:rPr>
+            <w:rStyle w:val="Hyperlink"/>
+            <w:lang w:val="en"/>
+          </w:rPr>
+          <w:t xml:space="preserve">karambinning.github.io/portfolio</w:t>
+        </w:r>
+      </w:hyperlink>
+      <w:r>
+        <w:rPr>
+          <w:lang w:val="en"/>
+        </w:rPr>
+        <w:t xml:space="preserve"> </w:t>
+      </w:r>
+      <w:r>
+        <w:rPr>
+          <w:lang w:val="en"/>
+        </w:rPr>
+        <w:t xml:space="preserve">(live demos of everything below) · UK national · Luton / Loughborough · Full UK driving licence</w:t>
+      </w:r>
+      <w:r>
+        <w:br/>
+      </w:r>
       <w:r>
         <w:rPr>
           <w:b/>
           <w:bCs/>
-        </w:rPr>
-        <w:t xml:space="preserve">Final-year BA History &amp; Politics, Loughborough University · Independent AI builder</w:t>
-      </w:r>
-      <w:r>
-        <w:br/>
-      </w:r>
-    </w:p>
-    <w:p>
-      <w:pPr>
-        <w:pStyle w:val="BodyText"/>
-      </w:pPr>
-      <w:r>
-        <w:t xml:space="preserve">K.S.Binning1-24@student.lboro.ac.uk · karambinning@gmail.com · 07951 882002</w:t>
-      </w:r>
-      <w:r>
-        <w:br/>
-      </w:r>
-      <w:r>
-        <w:t xml:space="preserve">Luton / Loughborough (London-commutable) · UK national · Full UK driving licence</w:t>
-      </w:r>
-      <w:r>
-        <w:br/>
-      </w:r>
-      <w:r>
-        <w:t xml:space="preserve">Portfolio: karambinning.github.io/portfolio</w:t>
-      </w:r>
-      <w:r>
-        <w:br/>
-      </w:r>
+          <w:lang w:val="en"/>
+        </w:rPr>
+        <w:t xml:space="preserve">Available:</w:t>
+      </w:r>
+      <w:r>
+        <w:rPr>
+          <w:lang w:val="en"/>
+        </w:rPr>
+        <w:t xml:space="preserve"> </w:t>
+      </w:r>
+      <w:r>
+        <w:rPr>
+          <w:lang w:val="en"/>
+        </w:rPr>
+        <w:t xml:space="preserve">December 2026 – January 2027 and summer 2027</w:t>
+      </w:r>
+    </w:p>
+    <w:bookmarkStart w:id="10" w:name="profile"/>
+    <w:p>
+      <w:pPr>
+        <w:pStyle w:val="Heading2"/>
+      </w:pPr>
+      <w:r>
+        <w:rPr>
+          <w:lang w:val="en"/>
+        </w:rPr>
+        <w:t xml:space="preserve">PROFILE</w:t>
+      </w:r>
+    </w:p>
+    <w:p>
+      <w:pPr>
+        <w:pStyle w:val="FirstParagraph"/>
+      </w:pPr>
+      <w:r>
+        <w:rPr>
+          <w:lang w:val="en"/>
+        </w:rPr>
+        <w:t xml:space="preserve">History and Politics student who, since March 2026 and with no programming background, has used Claude to design and run autonomous flight software, a small semi-autonomous agent fleet across four machines, and intelligence tooling, alongside a full degree. I study conflict, security and the international order, and I build AI systems that check their work before they claim it. Looking for an internship in applied AI, technology and security policy, intelligence analysis or research.</w:t>
+      </w:r>
+    </w:p>
+    <w:bookmarkEnd w:id="10"/>
+    <w:bookmarkStart w:id="11" w:name="education"/>
+    <w:p>
+      <w:pPr>
+        <w:pStyle w:val="Heading2"/>
+      </w:pPr>
+      <w:r>
+        <w:rPr>
+          <w:lang w:val="en"/>
+        </w:rPr>
+        <w:t xml:space="preserve">EDUCATION</w:t>
+      </w:r>
+    </w:p>
+    <w:p>
+      <w:pPr>
+        <w:pStyle w:val="FirstParagraph"/>
+      </w:pPr>
       <w:r>
         <w:rPr>
           <w:b/>
           <w:bCs/>
-        </w:rPr>
-        <w:t xml:space="preserve">Available:</w:t>
-      </w:r>
-      <w:r>
-        <w:t xml:space="preserve"> </w:t>
-      </w:r>
-      <w:r>
-        <w:t xml:space="preserve">December 2026 – January 2027 · Summer 2027 (planning a taught master’s in International Security, 2027–28)</w:t>
-      </w:r>
-    </w:p>
-    <w:p>
-      <w:r>
-        <w:pict>
-          <v:rect style="width:0;height:1.5pt" o:hralign="center" o:hrstd="t" o:hr="t"/>
-        </w:pict>
-      </w:r>
-    </w:p>
-    <w:bookmarkStart w:id="9" w:name="profile"/>
-    <w:p>
-      <w:pPr>
-        <w:pStyle w:val="Heading2"/>
-      </w:pPr>
-      <w:r>
-        <w:t xml:space="preserve">PROFILE</w:t>
-      </w:r>
-    </w:p>
-    <w:p>
-      <w:pPr>
-        <w:pStyle w:val="FirstParagraph"/>
-      </w:pPr>
-      <w:r>
-        <w:t xml:space="preserve">Final-year History and Politics student who builds working AI systems. Since March 2026, with no</w:t>
-      </w:r>
-      <w:r>
-        <w:t xml:space="preserve"> </w:t>
-      </w:r>
-      <w:r>
-        <w:t xml:space="preserve">programming background and Claude as my primary instrument, I have designed and shipped autonomous</w:t>
-      </w:r>
-      <w:r>
-        <w:t xml:space="preserve"> </w:t>
-      </w:r>
-      <w:r>
-        <w:t xml:space="preserve">flight software, a multi-agent infrastructure across a private fleet of machines, and intelligence</w:t>
-      </w:r>
-      <w:r>
-        <w:t xml:space="preserve"> </w:t>
-      </w:r>
-      <w:r>
-        <w:t xml:space="preserve">tooling — alongside a full degree. Academically I work on conflict, security and the international</w:t>
-      </w:r>
-      <w:r>
-        <w:t xml:space="preserve"> </w:t>
-      </w:r>
-      <w:r>
-        <w:t xml:space="preserve">order; technically, on AI systems that verify before they claim. I am looking for an internship</w:t>
-      </w:r>
-      <w:r>
-        <w:t xml:space="preserve"> </w:t>
-      </w:r>
-      <w:r>
-        <w:t xml:space="preserve">where both halves are useful: applied AI, technology and security policy, intelligence analysis or</w:t>
-      </w:r>
-      <w:r>
-        <w:t xml:space="preserve"> </w:t>
-      </w:r>
-      <w:r>
-        <w:t xml:space="preserve">research.</w:t>
-      </w:r>
-    </w:p>
-    <w:p>
-      <w:r>
-        <w:pict>
-          <v:rect style="width:0;height:1.5pt" o:hralign="center" o:hrstd="t" o:hr="t"/>
-        </w:pict>
-      </w:r>
-    </w:p>
-    <w:bookmarkEnd w:id="9"/>
-    <w:bookmarkStart w:id="10" w:name="X41abf8ec286738f3c3c6d5e7d8268553b9dbab4"/>
-    <w:p>
-      <w:pPr>
-        <w:pStyle w:val="Heading2"/>
-      </w:pPr>
-      <w:r>
-        <w:t xml:space="preserve">SELECTED WORK — BINNING.AI</w:t>
-      </w:r>
-      <w:r>
-        <w:t xml:space="preserve"> </w:t>
-      </w:r>
-      <w:r>
-        <w:rPr>
-          <w:i/>
-          <w:iCs/>
-        </w:rPr>
-        <w:t xml:space="preserve">(independent, March 2026 – present)</w:t>
-      </w:r>
-    </w:p>
-    <w:p>
-      <w:pPr>
-        <w:pStyle w:val="FirstParagraph"/>
-      </w:pPr>
-      <w:r>
-        <w:rPr>
-          <w:b/>
-          <w:bCs/>
-        </w:rPr>
-        <w:t xml:space="preserve">ICARUS — autonomous flight software for a DJI Mini 2</w:t>
+          <w:lang w:val="en"/>
+        </w:rPr>
+        <w:t xml:space="preserve">Loughborough University — BA (Hons) History &amp; Politics</w:t>
+      </w:r>
+      <w:r>
+        <w:rPr>
+          <w:lang w:val="en"/>
+        </w:rPr>
+        <w:t xml:space="preserve">2024 – 2027</w:t>
       </w:r>
     </w:p>
     <w:p>
@@ -170,13 +161,160 @@
         </w:numPr>
       </w:pPr>
       <w:r>
-        <w:t xml:space="preserve">Turned a consumer drone into an autonomous reconnaissance aircraft, with a 2019 Android handset as</w:t>
-      </w:r>
-      <w:r>
-        <w:t xml:space="preserve"> </w:t>
-      </w:r>
-      <w:r>
-        <w:t xml:space="preserve">flight computer, on my own software and at zero cost.</w:t>
+        <w:rPr>
+          <w:lang w:val="en"/>
+        </w:rPr>
+        <w:t xml:space="preserve">Selected marks: African States and Nations</w:t>
+      </w:r>
+      <w:r>
+        <w:rPr>
+          <w:lang w:val="en"/>
+        </w:rPr>
+        <w:t xml:space="preserve"> </w:t>
+      </w:r>
+      <w:r>
+        <w:rPr>
+          <w:b/>
+          <w:bCs/>
+          <w:lang w:val="en"/>
+        </w:rPr>
+        <w:t xml:space="preserve">70</w:t>
+      </w:r>
+      <w:r>
+        <w:rPr>
+          <w:lang w:val="en"/>
+        </w:rPr>
+        <w:t xml:space="preserve"> </w:t>
+      </w:r>
+      <w:r>
+        <w:rPr>
+          <w:lang w:val="en"/>
+        </w:rPr>
+        <w:t xml:space="preserve">· Politics of Development</w:t>
+      </w:r>
+      <w:r>
+        <w:rPr>
+          <w:lang w:val="en"/>
+        </w:rPr>
+        <w:t xml:space="preserve"> </w:t>
+      </w:r>
+      <w:r>
+        <w:rPr>
+          <w:b/>
+          <w:bCs/>
+          <w:lang w:val="en"/>
+        </w:rPr>
+        <w:t xml:space="preserve">66</w:t>
+      </w:r>
+      <w:r>
+        <w:rPr>
+          <w:lang w:val="en"/>
+        </w:rPr>
+        <w:t xml:space="preserve"> </w:t>
+      </w:r>
+      <w:r>
+        <w:rPr>
+          <w:lang w:val="en"/>
+        </w:rPr>
+        <w:t xml:space="preserve">· International Political Theory</w:t>
+      </w:r>
+      <w:r>
+        <w:rPr>
+          <w:lang w:val="en"/>
+        </w:rPr>
+        <w:t xml:space="preserve"> </w:t>
+      </w:r>
+      <w:r>
+        <w:rPr>
+          <w:b/>
+          <w:bCs/>
+          <w:lang w:val="en"/>
+        </w:rPr>
+        <w:t xml:space="preserve">66</w:t>
+      </w:r>
+      <w:r>
+        <w:rPr>
+          <w:lang w:val="en"/>
+        </w:rPr>
+        <w:t xml:space="preserve"> </w:t>
+      </w:r>
+      <w:r>
+        <w:rPr>
+          <w:lang w:val="en"/>
+        </w:rPr>
+        <w:t xml:space="preserve">· British India 1857–1947</w:t>
+      </w:r>
+      <w:r>
+        <w:rPr>
+          <w:lang w:val="en"/>
+        </w:rPr>
+        <w:t xml:space="preserve"> </w:t>
+      </w:r>
+      <w:r>
+        <w:rPr>
+          <w:b/>
+          <w:bCs/>
+          <w:lang w:val="en"/>
+        </w:rPr>
+        <w:t xml:space="preserve">65</w:t>
+      </w:r>
+      <w:r>
+        <w:rPr>
+          <w:lang w:val="en"/>
+        </w:rPr>
+        <w:t xml:space="preserve"> </w:t>
+      </w:r>
+      <w:r>
+        <w:rPr>
+          <w:lang w:val="en"/>
+        </w:rPr>
+        <w:t xml:space="preserve">· Making and Unmaking of the World Order</w:t>
+      </w:r>
+      <w:r>
+        <w:rPr>
+          <w:lang w:val="en"/>
+        </w:rPr>
+        <w:t xml:space="preserve"> </w:t>
+      </w:r>
+      <w:r>
+        <w:rPr>
+          <w:b/>
+          <w:bCs/>
+          <w:lang w:val="en"/>
+        </w:rPr>
+        <w:t xml:space="preserve">65</w:t>
+      </w:r>
+      <w:r>
+        <w:rPr>
+          <w:lang w:val="en"/>
+        </w:rPr>
+        <w:t xml:space="preserve"> </w:t>
+      </w:r>
+      <w:r>
+        <w:rPr>
+          <w:lang w:val="en"/>
+        </w:rPr>
+        <w:t xml:space="preserve">· Theories and Methods in Political Research</w:t>
+      </w:r>
+      <w:r>
+        <w:rPr>
+          <w:lang w:val="en"/>
+        </w:rPr>
+        <w:t xml:space="preserve"> </w:t>
+      </w:r>
+      <w:r>
+        <w:rPr>
+          <w:b/>
+          <w:bCs/>
+          <w:lang w:val="en"/>
+        </w:rPr>
+        <w:t xml:space="preserve">65</w:t>
+      </w:r>
+      <w:r>
+        <w:rPr>
+          <w:lang w:val="en"/>
+        </w:rPr>
+        <w:t xml:space="preserve">.</w:t>
       </w:r>
     </w:p>
     <w:p>
@@ -188,13 +326,32 @@
         </w:numPr>
       </w:pPr>
       <w:r>
-        <w:t xml:space="preserve">11,615 lines of Java across fourteen classes; 365 self-test assertions run on the physical handset</w:t>
-      </w:r>
-      <w:r>
-        <w:t xml:space="preserve"> </w:t>
-      </w:r>
-      <w:r>
-        <w:t xml:space="preserve">at every launch and have repeatedly caught regressions before flight.</w:t>
+        <w:rPr>
+          <w:b/>
+          <w:bCs/>
+          <w:lang w:val="en"/>
+        </w:rPr>
+        <w:t xml:space="preserve">Dissertation (in progress):</w:t>
+      </w:r>
+      <w:r>
+        <w:rPr>
+          <w:lang w:val="en"/>
+        </w:rPr>
+        <w:t xml:space="preserve"> </w:t>
+      </w:r>
+      <w:r>
+        <w:rPr>
+          <w:i/>
+          <w:iCs/>
+          <w:lang w:val="en"/>
+        </w:rPr>
+        <w:t xml:space="preserve">Great Power War as a Process</w:t>
+      </w:r>
+      <w:r>
+        <w:rPr>
+          <w:lang w:val="en"/>
+        </w:rPr>
+        <w:t xml:space="preserve">: what structural indicators of systemic conflict can and cannot predict, tested with forecasting software I built for it.</w:t>
       </w:r>
     </w:p>
     <w:p>
@@ -206,19 +363,10 @@
         </w:numPr>
       </w:pPr>
       <w:r>
-        <w:t xml:space="preserve">The control law carries its own safety envelope because the airframe has no obstacle sensing.</w:t>
-      </w:r>
-      <w:r>
-        <w:t xml:space="preserve"> </w:t>
-      </w:r>
-      <w:r>
-        <w:t xml:space="preserve">Three crashes documented with the fault each exposed; one feature paused on a measured physical</w:t>
-      </w:r>
-      <w:r>
-        <w:t xml:space="preserve"> </w:t>
-      </w:r>
-      <w:r>
-        <w:t xml:space="preserve">limit (the camera cannot resolve a hand beyond 5.8 m) rather than shipped on a guess.</w:t>
+        <w:rPr>
+          <w:lang w:val="en"/>
+        </w:rPr>
+        <w:t xml:space="preserve">Final year: The Soviet Security State · International Conflict Management · After Empire: South Asia · French. Planning a taught master's in International Security, 2027–28.</w:t>
       </w:r>
     </w:p>
     <w:p>
@@ -229,8 +377,71 @@
         <w:rPr>
           <w:b/>
           <w:bCs/>
-        </w:rPr>
-        <w:t xml:space="preserve">Agentic infrastructure — the system the work runs on</w:t>
+          <w:lang w:val="en"/>
+        </w:rPr>
+        <w:t xml:space="preserve">Harlington Upper School &amp; Sixth Form, Central Bedfordshire</w:t>
+      </w:r>
+    </w:p>
+    <w:p>
+      <w:pPr>
+        <w:pStyle w:val="BodyText"/>
+      </w:pPr>
+      <w:r>
+        <w:rPr>
+          <w:lang w:val="en"/>
+        </w:rPr>
+        <w:t xml:space="preserve">A-Levels: Psychology (B) · Criminology (B) · Media Studies (B) · 9 GCSEs.</w:t>
+      </w:r>
+      <w:r>
+        <w:rPr>
+          <w:lang w:val="en"/>
+        </w:rPr>
+        <w:t xml:space="preserve"> </w:t>
+      </w:r>
+      <w:r>
+        <w:rPr>
+          <w:b/>
+          <w:bCs/>
+          <w:lang w:val="en"/>
+        </w:rPr>
+        <w:t xml:space="preserve">Anthropic Academy:</w:t>
+      </w:r>
+      <w:r>
+        <w:rPr>
+          <w:lang w:val="en"/>
+        </w:rPr>
+        <w:t xml:space="preserve"> </w:t>
+      </w:r>
+      <w:r>
+        <w:rPr>
+          <w:lang w:val="en"/>
+        </w:rPr>
+        <w:t xml:space="preserve">AI Fluency, three courses completed.</w:t>
+      </w:r>
+    </w:p>
+    <w:bookmarkEnd w:id="11"/>
+    <w:bookmarkStart w:id="12" w:name="X41abf8ec286738f3c3c6d5e7d8268553b9dbab4"/>
+    <w:p>
+      <w:pPr>
+        <w:pStyle w:val="Heading2"/>
+      </w:pPr>
+      <w:r>
+        <w:rPr>
+          <w:lang w:val="en"/>
+        </w:rPr>
+        <w:t xml:space="preserve">SELECTED WORK — BINNING.AI</w:t>
+      </w:r>
+      <w:r>
+        <w:rPr>
+          <w:lang w:val="en"/>
+        </w:rPr>
+        <w:t xml:space="preserve"> </w:t>
+      </w:r>
+      <w:r>
+        <w:rPr>
+          <w:lang w:val="en"/>
+        </w:rPr>
+        <w:t xml:space="preserve">(independent, March 2026 – present)</w:t>
       </w:r>
     </w:p>
     <w:p>
@@ -242,13 +453,24 @@
         </w:numPr>
       </w:pPr>
       <w:r>
-        <w:t xml:space="preserve">A private mesh of four Macs, with a single command</w:t>
-      </w:r>
-      <w:r>
-        <w:t xml:space="preserve"> </w:t>
-      </w:r>
-      <w:r>
-        <w:t xml:space="preserve">centre and a 12 TB canonical archive of every project, session and note.</w:t>
+        <w:rPr>
+          <w:b/>
+          <w:bCs/>
+          <w:lang w:val="en"/>
+        </w:rPr>
+        <w:t xml:space="preserve">ICARUS — autonomous flight software for a DJI Mini 2.</w:t>
+      </w:r>
+      <w:r>
+        <w:rPr>
+          <w:lang w:val="en"/>
+        </w:rPr>
+        <w:t xml:space="preserve"> </w:t>
+      </w:r>
+      <w:r>
+        <w:rPr>
+          <w:lang w:val="en"/>
+        </w:rPr>
+        <w:t xml:space="preserve">Turned a consumer drone into an autonomous reconnaissance aircraft run from a 2019 Android phone, at zero cost. 552 self-test assertions run on the handset before every flight; three crashes documented with the fault each exposed; one feature paused on a measured camera limit rather than shipped on a guess.</w:t>
       </w:r>
     </w:p>
     <w:p>
@@ -260,13 +482,24 @@
         </w:numPr>
       </w:pPr>
       <w:r>
-        <w:t xml:space="preserve">A dedicated intelligence node with collectors across open-source intelligence, news, geopolitical</w:t>
-      </w:r>
-      <w:r>
-        <w:t xml:space="preserve"> </w:t>
-      </w:r>
-      <w:r>
-        <w:t xml:space="preserve">signal, market data and careers.</w:t>
+        <w:rPr>
+          <w:b/>
+          <w:bCs/>
+          <w:lang w:val="en"/>
+        </w:rPr>
+        <w:t xml:space="preserve">Agent fleet and second brain.</w:t>
+      </w:r>
+      <w:r>
+        <w:rPr>
+          <w:lang w:val="en"/>
+        </w:rPr>
+        <w:t xml:space="preserve"> </w:t>
+      </w:r>
+      <w:r>
+        <w:rPr>
+          <w:lang w:val="en"/>
+        </w:rPr>
+        <w:t xml:space="preserve">Four Macs sharing one 12 TB knowledge vault, with Claude agents for building, intelligence collection, security monitoring and review under a supervisor that restarts what fails. One rule throughout: no agent may mark its own work complete.</w:t>
       </w:r>
     </w:p>
     <w:p>
@@ -278,41 +511,24 @@
         </w:numPr>
       </w:pPr>
       <w:r>
-        <w:t xml:space="preserve">Agents run as Claude Code sessions — director, scout, builder, reviewer, archivist — under a</w:t>
-      </w:r>
-      <w:r>
-        <w:t xml:space="preserve"> </w:t>
-      </w:r>
-      <w:r>
-        <w:t xml:space="preserve">deterministic supervisor that probes every node every sixty seconds and restarts what has failed.</w:t>
-      </w:r>
-      <w:r>
-        <w:t xml:space="preserve"> </w:t>
-      </w:r>
-      <w:r>
-        <w:t xml:space="preserve">One rule throughout:</w:t>
-      </w:r>
-      <w:r>
-        <w:t xml:space="preserve"> </w:t>
-      </w:r>
-      <w:r>
         <w:rPr>
           <w:b/>
           <w:bCs/>
-        </w:rPr>
-        <w:t xml:space="preserve">no agent may mark its own work complete.</w:t>
-      </w:r>
-    </w:p>
-    <w:p>
-      <w:pPr>
-        <w:pStyle w:val="FirstParagraph"/>
-      </w:pPr>
-      <w:r>
-        <w:rPr>
-          <w:b/>
-          <w:bCs/>
-        </w:rPr>
-        <w:t xml:space="preserve">AI Declaration System — academic transparency tooling</w:t>
+          <w:lang w:val="en"/>
+        </w:rPr>
+        <w:t xml:space="preserve">Quantitative trading research.</w:t>
+      </w:r>
+      <w:r>
+        <w:rPr>
+          <w:lang w:val="en"/>
+        </w:rPr>
+        <w:t xml:space="preserve"> </w:t>
+      </w:r>
+      <w:r>
+        <w:rPr>
+          <w:lang w:val="en"/>
+        </w:rPr>
+        <w:t xml:space="preserve">A paper-traded engine for five-minute crypto markets turned $50 into $106.56 over 289 trades. I then built an order-book fill check, found only 2 of 304 orders would have filled at the assumed price, and invalidated the result myself.</w:t>
       </w:r>
     </w:p>
     <w:p>
@@ -320,40 +536,75 @@
         <w:pStyle w:val="Compact"/>
         <w:numPr>
           <w:ilvl w:val="0"/>
-          <w:numId w:val="1003"/>
+          <w:numId w:val="1002"/>
         </w:numPr>
-      </w:pPr>
-      <w:r>
-        <w:t xml:space="preserve">Built in Claude Code to govern my own academic AI use: logs how AI was involved in a piece of work</w:t>
-      </w:r>
-      <w:r>
-        <w:t xml:space="preserve"> </w:t>
-      </w:r>
-      <w:r>
-        <w:t xml:space="preserve">and generates a declaration page for the front of the submitted essay. Designed to sit inside</w:t>
-      </w:r>
-      <w:r>
-        <w:t xml:space="preserve"> </w:t>
-      </w:r>
-      <w:r>
-        <w:t xml:space="preserve">Loughborough’s AI-use guidelines.</w:t>
-      </w:r>
-    </w:p>
-    <w:p>
-      <w:pPr>
-        <w:pStyle w:val="FirstParagraph"/>
       </w:pPr>
       <w:r>
         <w:rPr>
           <w:b/>
           <w:bCs/>
-        </w:rPr>
-        <w:t xml:space="preserve">KAM — a</w:t>
-      </w:r>
+          <w:lang w:val="en"/>
+        </w:rPr>
+        <w:t xml:space="preserve">Also:</w:t>
+      </w:r>
+      <w:r>
+        <w:rPr>
+          <w:lang w:val="en"/>
+        </w:rPr>
+        <w:t xml:space="preserve"> </w:t>
+      </w:r>
+      <w:r>
+        <w:rPr>
+          <w:lang w:val="en"/>
+        </w:rPr>
+        <w:t xml:space="preserve">KAM, a private-beta intelligence platform that hosts my dissertation model · an AI-use declaration system for my own coursework · Future Warfare, red- and blue-team drills against my own infrastructure.</w:t>
+      </w:r>
+    </w:p>
+    <w:bookmarkEnd w:id="12"/>
+    <w:bookmarkStart w:id="13" w:name="leadership-and-employment"/>
+    <w:p>
+      <w:pPr>
+        <w:pStyle w:val="Heading2"/>
+      </w:pPr>
+      <w:r>
+        <w:rPr>
+          <w:lang w:val="en"/>
+        </w:rPr>
+        <w:t xml:space="preserve">LEADERSHIP AND EMPLOYMENT</w:t>
+      </w:r>
+    </w:p>
+    <w:p>
+      <w:pPr>
+        <w:pStyle w:val="FirstParagraph"/>
+      </w:pPr>
       <w:r>
         <w:rPr>
           <w:b/>
           <w:bCs/>
+          <w:lang w:val="en"/>
+        </w:rPr>
+        <w:t xml:space="preserve">Head Student, Sixth Form and Upper School — Harlington</w:t>
+      </w:r>
+      <w:r>
+        <w:rPr>
+          <w:lang w:val="en"/>
+        </w:rPr>
+        <w:t xml:space="preserve">2023 – 2024</w:t>
+      </w:r>
+    </w:p>
+    <w:p>
+      <w:pPr>
+        <w:pStyle w:val="BodyText"/>
+      </w:pPr>
+      <w:r>
+        <w:rPr>
+          <w:lang w:val="en"/>
+        </w:rPr>
+        <w:t xml:space="preserve">Elected by staff to lead the student leadership team; ran the year's major events and spoke for the school at open days and visits from politicians. Organised a Movember fundraiser end to end, raising</w:t>
+      </w:r>
+      <w:r>
+        <w:rPr>
+          <w:lang w:val="en"/>
         </w:rPr>
         <w:t xml:space="preserve"> </w:t>
       </w:r>
@@ -361,100 +612,112 @@
         <w:rPr>
           <w:b/>
           <w:bCs/>
-        </w:rPr>
-        <w:t xml:space="preserve">“human operating system”</w:t>
-      </w:r>
+          <w:lang w:val="en"/>
+        </w:rPr>
+        <w:t xml:space="preserve">£750, the most any single student has raised for the school.</w:t>
+      </w:r>
+    </w:p>
+    <w:p>
+      <w:pPr>
+        <w:pStyle w:val="BodyText"/>
+      </w:pPr>
       <w:r>
         <w:rPr>
           <w:b/>
           <w:bCs/>
-        </w:rPr>
-        <w:t xml:space="preserve"> </w:t>
-      </w:r>
+          <w:lang w:val="en"/>
+        </w:rPr>
+        <w:t xml:space="preserve">Team Member — Bargain Booze, Loughborough</w:t>
+      </w:r>
+      <w:r>
+        <w:rPr>
+          <w:lang w:val="en"/>
+        </w:rPr>
+        <w:t xml:space="preserve">2026 – present</w:t>
+      </w:r>
+    </w:p>
+    <w:p>
+      <w:pPr>
+        <w:pStyle w:val="BodyText"/>
+      </w:pPr>
+      <w:r>
+        <w:rPr>
+          <w:lang w:val="en"/>
+        </w:rPr>
+        <w:t xml:space="preserve">Licensed retail alongside final year: customer service, restocking and store presentation.</w:t>
+      </w:r>
+    </w:p>
+    <w:p>
+      <w:pPr>
+        <w:pStyle w:val="BodyText"/>
+      </w:pPr>
       <w:r>
         <w:rPr>
           <w:b/>
           <w:bCs/>
-        </w:rPr>
-        <w:t xml:space="preserve">(concept stage, pre-beta)</w:t>
-      </w:r>
-    </w:p>
-    <w:p>
-      <w:pPr>
-        <w:pStyle w:val="Compact"/>
-        <w:numPr>
-          <w:ilvl w:val="0"/>
-          <w:numId w:val="1004"/>
-        </w:numPr>
-      </w:pPr>
-      <w:r>
-        <w:t xml:space="preserve">Around twenty-five modules behind a central hub, including WORLD, a layered model of the planet</w:t>
-      </w:r>
-      <w:r>
-        <w:t xml:space="preserve"> </w:t>
-      </w:r>
-      <w:r>
-        <w:t xml:space="preserve">with a temporal slider through migration, empire and war, and a Council that convenes strategic,</w:t>
-      </w:r>
-      <w:r>
-        <w:t xml:space="preserve"> </w:t>
-      </w:r>
-      <w:r>
-        <w:t xml:space="preserve">economic, legal and ethical perspectives on a decision while the user remains the one who decides.</w:t>
-      </w:r>
-    </w:p>
-    <w:p>
-      <w:pPr>
-        <w:pStyle w:val="Compact"/>
-        <w:numPr>
-          <w:ilvl w:val="0"/>
-          <w:numId w:val="1004"/>
-        </w:numPr>
-      </w:pPr>
-      <w:r>
-        <w:t xml:space="preserve">Interfaces and navigation built; intelligence and data layers still largely scaffolding. Hosts my</w:t>
-      </w:r>
-      <w:r>
-        <w:t xml:space="preserve"> </w:t>
-      </w:r>
-      <w:r>
-        <w:t xml:space="preserve">dissertation’s predictive model.</w:t>
-      </w:r>
-    </w:p>
-    <w:p>
-      <w:pPr>
-        <w:pStyle w:val="FirstParagraph"/>
+          <w:lang w:val="en"/>
+        </w:rPr>
+        <w:t xml:space="preserve">Team Member — Buy Sell and Loan (Questar Ltd), Luton</w:t>
+      </w:r>
+      <w:r>
+        <w:rPr>
+          <w:lang w:val="en"/>
+        </w:rPr>
+        <w:t xml:space="preserve">2024 – present</w:t>
+      </w:r>
+    </w:p>
+    <w:p>
+      <w:pPr>
+        <w:pStyle w:val="BodyText"/>
+      </w:pPr>
+      <w:r>
+        <w:rPr>
+          <w:lang w:val="en"/>
+        </w:rPr>
+        <w:t xml:space="preserve">Regulated retail in high-value goods: item valuation, compliant record-keeping, cash handling, running the store independently.</w:t>
+      </w:r>
+    </w:p>
+    <w:p>
+      <w:pPr>
+        <w:pStyle w:val="BodyText"/>
       </w:pPr>
       <w:r>
         <w:rPr>
           <w:b/>
           <w:bCs/>
-        </w:rPr>
-        <w:t xml:space="preserve">Future Warfare — a civilian security curriculum inside KAM</w:t>
-      </w:r>
-    </w:p>
-    <w:p>
-      <w:pPr>
-        <w:pStyle w:val="Compact"/>
-        <w:numPr>
-          <w:ilvl w:val="0"/>
-          <w:numId w:val="1005"/>
-        </w:numPr>
-      </w:pPr>
-      <w:r>
-        <w:t xml:space="preserve">Six modules (cyber security, AI defence, autonomous systems, space, drones, pilot training) on the</w:t>
-      </w:r>
-      <w:r>
-        <w:t xml:space="preserve"> </w:t>
-      </w:r>
-      <w:r>
-        <w:t xml:space="preserve">premise that the modern conflict surface reaches civilians first. Tested on myself: paired red-team</w:t>
-      </w:r>
-      <w:r>
-        <w:t xml:space="preserve"> </w:t>
-      </w:r>
-      <w:r>
-        <w:t xml:space="preserve">and blue-team drills against my own infrastructure, including brute-force attempts on my own SSH.</w:t>
+          <w:lang w:val="en"/>
+        </w:rPr>
+        <w:t xml:space="preserve">Team Member — Pret A Manger, Luton Airport (airside)</w:t>
+      </w:r>
+      <w:r>
+        <w:rPr>
+          <w:lang w:val="en"/>
+        </w:rPr>
+        <w:t xml:space="preserve">2022 – 2024</w:t>
+      </w:r>
+    </w:p>
+    <w:p>
+      <w:pPr>
+        <w:pStyle w:val="BodyText"/>
+      </w:pPr>
+      <w:r>
+        <w:rPr>
+          <w:lang w:val="en"/>
+        </w:rPr>
+        <w:t xml:space="preserve">High-volume service at one of Pret's busiest UK sites; barista training taken on above grade; ran the kiosk through to closing.</w:t>
+      </w:r>
+    </w:p>
+    <w:bookmarkEnd w:id="13"/>
+    <w:bookmarkStart w:id="14" w:name="skills"/>
+    <w:p>
+      <w:pPr>
+        <w:pStyle w:val="Heading2"/>
+      </w:pPr>
+      <w:r>
+        <w:rPr>
+          <w:lang w:val="en"/>
+        </w:rPr>
+        <w:t xml:space="preserve">SKILLS</w:t>
       </w:r>
     </w:p>
     <w:p>
@@ -465,699 +728,76 @@
         <w:rPr>
           <w:b/>
           <w:bCs/>
-        </w:rPr>
-        <w:t xml:space="preserve">Polymarket War Room — paper-traded market engine</w:t>
-      </w:r>
-    </w:p>
-    <w:p>
-      <w:pPr>
-        <w:pStyle w:val="Compact"/>
-        <w:numPr>
-          <w:ilvl w:val="0"/>
-          <w:numId w:val="1006"/>
-        </w:numPr>
-      </w:pPr>
-      <w:r>
-        <w:t xml:space="preserve">Three bot configurations on five-minute crypto markets. Best: $50 → $106.56 (+113%) over 289</w:t>
-      </w:r>
-      <w:r>
-        <w:t xml:space="preserve"> </w:t>
-      </w:r>
-      <w:r>
-        <w:t xml:space="preserve">trades at a 64.7% win rate — paper-traded, no capital at risk. I then wrote the assessment showing</w:t>
-      </w:r>
-      <w:r>
-        <w:t xml:space="preserve"> </w:t>
-      </w:r>
-      <w:r>
-        <w:t xml:space="preserve">the result does not transfer to other market classes, and kept only the portable finding.</w:t>
-      </w:r>
-    </w:p>
-    <w:p>
-      <w:pPr>
-        <w:pStyle w:val="FirstParagraph"/>
-      </w:pPr>
-      <w:r>
-        <w:rPr>
-          <w:i/>
-          <w:iCs/>
-        </w:rPr>
-        <w:t xml:space="preserve">Method across all of it: instrument before theorising, verify before trusting, let the measurement</w:t>
-      </w:r>
-      <w:r>
-        <w:rPr>
-          <w:i/>
-          <w:iCs/>
-        </w:rPr>
-        <w:t xml:space="preserve"> </w:t>
-      </w:r>
-      <w:r>
-        <w:rPr>
-          <w:i/>
-          <w:iCs/>
-        </w:rPr>
-        <w:t xml:space="preserve">close the argument.</w:t>
-      </w:r>
-    </w:p>
-    <w:p>
-      <w:r>
-        <w:pict>
-          <v:rect style="width:0;height:1.5pt" o:hralign="center" o:hrstd="t" o:hr="t"/>
-        </w:pict>
-      </w:r>
-    </w:p>
-    <w:bookmarkEnd w:id="10"/>
-    <w:bookmarkStart w:id="11" w:name="education"/>
-    <w:p>
-      <w:pPr>
-        <w:pStyle w:val="Heading2"/>
-      </w:pPr>
-      <w:r>
-        <w:t xml:space="preserve">EDUCATION</w:t>
-      </w:r>
-    </w:p>
-    <w:p>
-      <w:pPr>
-        <w:pStyle w:val="FirstParagraph"/>
+          <w:lang w:val="en"/>
+        </w:rPr>
+        <w:t xml:space="preserve">AI / technical:</w:t>
+      </w:r>
+      <w:r>
+        <w:rPr>
+          <w:lang w:val="en"/>
+        </w:rPr>
+        <w:t xml:space="preserve"> </w:t>
+      </w:r>
+      <w:r>
+        <w:rPr>
+          <w:lang w:val="en"/>
+        </w:rPr>
+        <w:t xml:space="preserve">Claude and Claude Code · multi-agent orchestration · prompt and context engineering · retrieval-augmented generation · Python and Java (AI-assisted) · testing and evaluation · Linux, networking, self-hosted infrastructure.</w:t>
+      </w:r>
+    </w:p>
+    <w:p>
+      <w:pPr>
+        <w:pStyle w:val="BodyText"/>
       </w:pPr>
       <w:r>
         <w:rPr>
           <w:b/>
           <w:bCs/>
-        </w:rPr>
-        <w:t xml:space="preserve">Loughborough University — BA (Hons) History &amp; Politics</w:t>
-      </w:r>
-      <w:r>
-        <w:t xml:space="preserve"> </w:t>
-      </w:r>
-      <w:r>
-        <w:t xml:space="preserve">· 2024 – 2027, final year</w:t>
-      </w:r>
-    </w:p>
-    <w:p>
-      <w:pPr>
-        <w:pStyle w:val="Compact"/>
-        <w:numPr>
-          <w:ilvl w:val="0"/>
-          <w:numId w:val="1007"/>
-        </w:numPr>
-      </w:pPr>
-      <w:r>
-        <w:t xml:space="preserve">Selected marks: African States and Nations</w:t>
-      </w:r>
-      <w:r>
+          <w:lang w:val="en"/>
+        </w:rPr>
+        <w:t xml:space="preserve">Research / analysis:</w:t>
+      </w:r>
+      <w:r>
+        <w:rPr>
+          <w:lang w:val="en"/>
+        </w:rPr>
+        <w:t xml:space="preserve"> </w:t>
+      </w:r>
+      <w:r>
+        <w:rPr>
+          <w:lang w:val="en"/>
+        </w:rPr>
+        <w:t xml:space="preserve">OSINT methodology and multi-source verification · research design · structured synthesis · written analysis to deadline.</w:t>
+      </w:r>
+      <w:r>
+        <w:rPr>
+          <w:lang w:val="en"/>
+        </w:rPr>
         <w:t xml:space="preserve"> </w:t>
       </w:r>
       <w:r>
         <w:rPr>
           <w:b/>
           <w:bCs/>
-        </w:rPr>
-        <w:t xml:space="preserve">70</w:t>
-      </w:r>
-      <w:r>
-        <w:t xml:space="preserve"> </w:t>
-      </w:r>
-      <w:r>
-        <w:t xml:space="preserve">· Politics of Development</w:t>
-      </w:r>
-      <w:r>
-        <w:t xml:space="preserve"> </w:t>
-      </w:r>
-      <w:r>
-        <w:rPr>
-          <w:b/>
-          <w:bCs/>
-        </w:rPr>
-        <w:t xml:space="preserve">66</w:t>
-      </w:r>
-      <w:r>
-        <w:t xml:space="preserve"> </w:t>
-      </w:r>
-      <w:r>
-        <w:t xml:space="preserve">· International</w:t>
-      </w:r>
-      <w:r>
-        <w:t xml:space="preserve"> </w:t>
-      </w:r>
-      <w:r>
-        <w:t xml:space="preserve">Political Theory</w:t>
-      </w:r>
-      <w:r>
-        <w:t xml:space="preserve"> </w:t>
-      </w:r>
-      <w:r>
-        <w:rPr>
-          <w:b/>
-          <w:bCs/>
-        </w:rPr>
-        <w:t xml:space="preserve">66</w:t>
-      </w:r>
-      <w:r>
-        <w:t xml:space="preserve"> </w:t>
-      </w:r>
-      <w:r>
-        <w:t xml:space="preserve">· British India, 1857–1947</w:t>
-      </w:r>
-      <w:r>
-        <w:t xml:space="preserve"> </w:t>
-      </w:r>
-      <w:r>
-        <w:rPr>
-          <w:b/>
-          <w:bCs/>
-        </w:rPr>
-        <w:t xml:space="preserve">65</w:t>
-      </w:r>
-      <w:r>
-        <w:t xml:space="preserve"> </w:t>
-      </w:r>
-      <w:r>
-        <w:t xml:space="preserve">· The Making and Unmaking of the World</w:t>
-      </w:r>
-      <w:r>
-        <w:t xml:space="preserve"> </w:t>
-      </w:r>
-      <w:r>
-        <w:t xml:space="preserve">Order</w:t>
-      </w:r>
-      <w:r>
-        <w:t xml:space="preserve"> </w:t>
-      </w:r>
-      <w:r>
-        <w:rPr>
-          <w:b/>
-          <w:bCs/>
-        </w:rPr>
-        <w:t xml:space="preserve">65</w:t>
-      </w:r>
-      <w:r>
-        <w:t xml:space="preserve"> </w:t>
-      </w:r>
-      <w:r>
-        <w:t xml:space="preserve">· Theories and Methods in Political Research</w:t>
-      </w:r>
-      <w:r>
-        <w:t xml:space="preserve"> </w:t>
-      </w:r>
-      <w:r>
-        <w:rPr>
-          <w:b/>
-          <w:bCs/>
-        </w:rPr>
-        <w:t xml:space="preserve">65</w:t>
-      </w:r>
-      <w:r>
-        <w:t xml:space="preserve">.</w:t>
-      </w:r>
-    </w:p>
-    <w:p>
-      <w:pPr>
-        <w:pStyle w:val="Compact"/>
-        <w:numPr>
-          <w:ilvl w:val="0"/>
-          <w:numId w:val="1007"/>
-        </w:numPr>
-      </w:pPr>
-      <w:r>
-        <w:t xml:space="preserve">Final-year modules: Dissertation · The Soviet Security State · After Empire: South Asia ·</w:t>
-      </w:r>
-      <w:r>
-        <w:t xml:space="preserve"> </w:t>
-      </w:r>
-      <w:r>
-        <w:t xml:space="preserve">International Conflict Management · French.</w:t>
-      </w:r>
-    </w:p>
-    <w:p>
-      <w:pPr>
-        <w:pStyle w:val="Compact"/>
-        <w:numPr>
-          <w:ilvl w:val="0"/>
-          <w:numId w:val="1007"/>
-        </w:numPr>
-      </w:pPr>
-      <w:r>
-        <w:rPr>
-          <w:b/>
-          <w:bCs/>
-        </w:rPr>
-        <w:t xml:space="preserve">Dissertation (in progress):</w:t>
-      </w:r>
-      <w:r>
-        <w:t xml:space="preserve"> </w:t>
-      </w:r>
-      <w:r>
-        <w:rPr>
-          <w:i/>
-          <w:iCs/>
-        </w:rPr>
-        <w:t xml:space="preserve">Great Power War as a Process</w:t>
-      </w:r>
-      <w:r>
-        <w:t xml:space="preserve"> </w:t>
-      </w:r>
-      <w:r>
-        <w:t xml:space="preserve">— major conflict read as a long</w:t>
-      </w:r>
-      <w:r>
-        <w:t xml:space="preserve"> </w:t>
-      </w:r>
-      <w:r>
-        <w:t xml:space="preserve">structural process rather than a dated event, tested with a predictive model built for civilian</w:t>
-      </w:r>
-      <w:r>
-        <w:t xml:space="preserve"> </w:t>
-      </w:r>
-      <w:r>
-        <w:t xml:space="preserve">geopolitical and security analysis.</w:t>
-      </w:r>
-    </w:p>
-    <w:p>
-      <w:pPr>
-        <w:pStyle w:val="Compact"/>
-        <w:numPr>
-          <w:ilvl w:val="0"/>
-          <w:numId w:val="1007"/>
-        </w:numPr>
-      </w:pPr>
-      <w:r>
-        <w:t xml:space="preserve">Declared AI use from the start: for British India I used Claude to build a reading guide, wrote the</w:t>
-      </w:r>
-      <w:r>
-        <w:t xml:space="preserve"> </w:t>
-      </w:r>
-      <w:r>
-        <w:t xml:space="preserve">essay entirely myself, and stated the AI involvement on the front page.</w:t>
-      </w:r>
-    </w:p>
-    <w:p>
-      <w:pPr>
-        <w:pStyle w:val="Compact"/>
-        <w:numPr>
-          <w:ilvl w:val="0"/>
-          <w:numId w:val="1007"/>
-        </w:numPr>
-      </w:pPr>
-      <w:r>
-        <w:t xml:space="preserve">Planning a one-year taught master’s in International Security, 2027–28.</w:t>
-      </w:r>
-    </w:p>
-    <w:p>
-      <w:pPr>
-        <w:pStyle w:val="FirstParagraph"/>
-      </w:pPr>
-      <w:r>
-        <w:rPr>
-          <w:b/>
-          <w:bCs/>
-        </w:rPr>
-        <w:t xml:space="preserve">Anthropic Academy</w:t>
-      </w:r>
-      <w:r>
-        <w:t xml:space="preserve"> </w:t>
-      </w:r>
-      <w:r>
-        <w:t xml:space="preserve">· AI Fluency for Students · AI Fluency: Capabilities and Limits · AI Fluency:</w:t>
-      </w:r>
-      <w:r>
-        <w:t xml:space="preserve"> </w:t>
-      </w:r>
-      <w:r>
-        <w:t xml:space="preserve">Framework and Foundations (all completed)</w:t>
-      </w:r>
-    </w:p>
-    <w:p>
-      <w:pPr>
-        <w:pStyle w:val="BodyText"/>
-      </w:pPr>
-      <w:r>
-        <w:rPr>
-          <w:b/>
-          <w:bCs/>
-        </w:rPr>
-        <w:t xml:space="preserve">Harlington Upper School &amp; Sixth Form, Central Bedfordshire</w:t>
-      </w:r>
-      <w:r>
-        <w:t xml:space="preserve"> </w:t>
-      </w:r>
-      <w:r>
-        <w:t xml:space="preserve">· A-Levels: Psychology (B) ·</w:t>
-      </w:r>
-      <w:r>
-        <w:t xml:space="preserve"> </w:t>
-      </w:r>
-      <w:r>
-        <w:t xml:space="preserve">Criminology (B) · Media Studies (B) · 9 GCSEs</w:t>
-      </w:r>
-    </w:p>
-    <w:p>
-      <w:r>
-        <w:pict>
-          <v:rect style="width:0;height:1.5pt" o:hralign="center" o:hrstd="t" o:hr="t"/>
-        </w:pict>
-      </w:r>
-    </w:p>
-    <w:bookmarkEnd w:id="11"/>
-    <w:bookmarkStart w:id="12" w:name="leadership"/>
-    <w:p>
-      <w:pPr>
-        <w:pStyle w:val="Heading2"/>
-      </w:pPr>
-      <w:r>
-        <w:t xml:space="preserve">LEADERSHIP</w:t>
-      </w:r>
-    </w:p>
-    <w:p>
-      <w:pPr>
-        <w:pStyle w:val="FirstParagraph"/>
-      </w:pPr>
-      <w:r>
-        <w:rPr>
-          <w:b/>
-          <w:bCs/>
-        </w:rPr>
-        <w:t xml:space="preserve">Head Student, Sixth Form and Upper School — Harlington</w:t>
-      </w:r>
-      <w:r>
-        <w:t xml:space="preserve"> </w:t>
-      </w:r>
-      <w:r>
-        <w:t xml:space="preserve">· 2023 – 2024</w:t>
-      </w:r>
-    </w:p>
-    <w:p>
-      <w:pPr>
-        <w:pStyle w:val="Compact"/>
-        <w:numPr>
-          <w:ilvl w:val="0"/>
-          <w:numId w:val="1008"/>
-        </w:numPr>
-      </w:pPr>
-      <w:r>
-        <w:t xml:space="preserve">Elected by staff to lead the student leadership team; the link between students and senior staff.</w:t>
-      </w:r>
-    </w:p>
-    <w:p>
-      <w:pPr>
-        <w:pStyle w:val="Compact"/>
-        <w:numPr>
-          <w:ilvl w:val="0"/>
-          <w:numId w:val="1008"/>
-        </w:numPr>
-      </w:pPr>
-      <w:r>
-        <w:t xml:space="preserve">Planned and delivered the school’s major events across the year, including prom and leavers’ day.</w:t>
-      </w:r>
-    </w:p>
-    <w:p>
-      <w:pPr>
-        <w:pStyle w:val="Compact"/>
-        <w:numPr>
-          <w:ilvl w:val="0"/>
-          <w:numId w:val="1008"/>
-        </w:numPr>
-      </w:pPr>
-      <w:r>
-        <w:t xml:space="preserve">Represented the school publicly: open-day speeches to prospective students, a community residents’</w:t>
-      </w:r>
-      <w:r>
-        <w:t xml:space="preserve"> </w:t>
-      </w:r>
-      <w:r>
-        <w:t xml:space="preserve">tea party I hosted, and visits from politicians.</w:t>
-      </w:r>
-    </w:p>
-    <w:p>
-      <w:pPr>
-        <w:pStyle w:val="Compact"/>
-        <w:numPr>
-          <w:ilvl w:val="0"/>
-          <w:numId w:val="1008"/>
-        </w:numPr>
-      </w:pPr>
-      <w:r>
-        <w:t xml:space="preserve">Organised and fronted a Movember fundraiser end to end, raising</w:t>
-      </w:r>
-      <w:r>
-        <w:t xml:space="preserve"> </w:t>
-      </w:r>
-      <w:r>
-        <w:rPr>
-          <w:b/>
-          <w:bCs/>
-        </w:rPr>
-        <w:t xml:space="preserve">£750 — the most any single</w:t>
-      </w:r>
-      <w:r>
-        <w:rPr>
-          <w:b/>
-          <w:bCs/>
-        </w:rPr>
-        <w:t xml:space="preserve"> </w:t>
-      </w:r>
-      <w:r>
-        <w:rPr>
-          <w:b/>
-          <w:bCs/>
-        </w:rPr>
-        <w:t xml:space="preserve">student has raised for the school.</w:t>
-      </w:r>
-    </w:p>
-    <w:p>
-      <w:r>
-        <w:pict>
-          <v:rect style="width:0;height:1.5pt" o:hralign="center" o:hrstd="t" o:hr="t"/>
-        </w:pict>
-      </w:r>
-    </w:p>
-    <w:bookmarkEnd w:id="12"/>
-    <w:bookmarkStart w:id="13" w:name="employment"/>
-    <w:p>
-      <w:pPr>
-        <w:pStyle w:val="Heading2"/>
-      </w:pPr>
-      <w:r>
-        <w:t xml:space="preserve">EMPLOYMENT</w:t>
-      </w:r>
-    </w:p>
-    <w:p>
-      <w:pPr>
-        <w:pStyle w:val="FirstParagraph"/>
-      </w:pPr>
-      <w:r>
-        <w:rPr>
-          <w:b/>
-          <w:bCs/>
-        </w:rPr>
-        <w:t xml:space="preserve">Team Member — Bargain Booze, Loughborough</w:t>
-      </w:r>
-      <w:r>
-        <w:t xml:space="preserve"> </w:t>
-      </w:r>
-      <w:r>
-        <w:t xml:space="preserve">· 2026 – present</w:t>
-      </w:r>
-    </w:p>
-    <w:p>
-      <w:pPr>
-        <w:pStyle w:val="BodyText"/>
-      </w:pPr>
-      <w:r>
-        <w:t xml:space="preserve">Licensed retail alongside my final year: customer service, restocking and store presentation.</w:t>
-      </w:r>
-    </w:p>
-    <w:p>
-      <w:pPr>
-        <w:pStyle w:val="BodyText"/>
-      </w:pPr>
-      <w:r>
-        <w:rPr>
-          <w:b/>
-          <w:bCs/>
-        </w:rPr>
-        <w:t xml:space="preserve">Team Member — Buy Sell and Loan (Questar Ltd), Luton</w:t>
-      </w:r>
-      <w:r>
-        <w:t xml:space="preserve"> </w:t>
-      </w:r>
-      <w:r>
-        <w:t xml:space="preserve">· 2024 – present</w:t>
-      </w:r>
-    </w:p>
-    <w:p>
-      <w:pPr>
-        <w:pStyle w:val="BodyText"/>
-      </w:pPr>
-      <w:r>
-        <w:t xml:space="preserve">Regulated retail in high-value electronics, jewellery and luxury goods: item valuation, compliant</w:t>
-      </w:r>
-      <w:r>
-        <w:t xml:space="preserve"> </w:t>
-      </w:r>
-      <w:r>
-        <w:t xml:space="preserve">record-keeping, cash handling and independent operation across the store.</w:t>
-      </w:r>
-    </w:p>
-    <w:p>
-      <w:pPr>
-        <w:pStyle w:val="BodyText"/>
-      </w:pPr>
-      <w:r>
-        <w:rPr>
-          <w:b/>
-          <w:bCs/>
-        </w:rPr>
-        <w:t xml:space="preserve">Team Member — Pret A Manger, Luton Airport (airside)</w:t>
-      </w:r>
-      <w:r>
-        <w:t xml:space="preserve"> </w:t>
-      </w:r>
-      <w:r>
-        <w:t xml:space="preserve">· 2022 – 2024</w:t>
-      </w:r>
-    </w:p>
-    <w:p>
-      <w:pPr>
-        <w:pStyle w:val="BodyText"/>
-      </w:pPr>
-      <w:r>
-        <w:t xml:space="preserve">One of Pret’s highest-footfall UK sites: high-volume service under time pressure, barista training</w:t>
-      </w:r>
-      <w:r>
-        <w:t xml:space="preserve"> </w:t>
-      </w:r>
-      <w:r>
-        <w:t xml:space="preserve">taken on above grade, and the kiosk run independently through to closing.</w:t>
-      </w:r>
-    </w:p>
-    <w:p>
-      <w:r>
-        <w:pict>
-          <v:rect style="width:0;height:1.5pt" o:hralign="center" o:hrstd="t" o:hr="t"/>
-        </w:pict>
-      </w:r>
-    </w:p>
-    <w:bookmarkEnd w:id="13"/>
-    <w:bookmarkStart w:id="14" w:name="skills"/>
-    <w:p>
-      <w:pPr>
-        <w:pStyle w:val="Heading2"/>
-      </w:pPr>
-      <w:r>
-        <w:t xml:space="preserve">SKILLS</w:t>
-      </w:r>
-    </w:p>
-    <w:p>
-      <w:pPr>
-        <w:pStyle w:val="FirstParagraph"/>
-      </w:pPr>
-      <w:r>
-        <w:rPr>
-          <w:b/>
-          <w:bCs/>
-        </w:rPr>
-        <w:t xml:space="preserve">AI / technical:</w:t>
-      </w:r>
-      <w:r>
-        <w:t xml:space="preserve"> </w:t>
-      </w:r>
-      <w:r>
-        <w:t xml:space="preserve">Claude and Claude Code · multi-agent orchestration · prompt and context</w:t>
-      </w:r>
-      <w:r>
-        <w:t xml:space="preserve"> </w:t>
-      </w:r>
-      <w:r>
-        <w:t xml:space="preserve">engineering · retrieval-augmented generation · Python and Java (AI-assisted) · evaluation and</w:t>
-      </w:r>
-      <w:r>
-        <w:t xml:space="preserve"> </w:t>
-      </w:r>
-      <w:r>
-        <w:t xml:space="preserve">self-test discipline · Linux, networking and self-hosted infrastructure.</w:t>
-      </w:r>
-    </w:p>
-    <w:p>
-      <w:pPr>
-        <w:pStyle w:val="BodyText"/>
-      </w:pPr>
-      <w:r>
-        <w:rPr>
-          <w:b/>
-          <w:bCs/>
-        </w:rPr>
-        <w:t xml:space="preserve">Research / analysis:</w:t>
-      </w:r>
-      <w:r>
-        <w:t xml:space="preserve"> </w:t>
-      </w:r>
-      <w:r>
-        <w:t xml:space="preserve">OSINT methodology and multi-source verification · research design ·</w:t>
-      </w:r>
-      <w:r>
-        <w:t xml:space="preserve"> </w:t>
-      </w:r>
-      <w:r>
-        <w:t xml:space="preserve">structured synthesis · written analysis to deadline.</w:t>
-      </w:r>
-    </w:p>
-    <w:p>
-      <w:pPr>
-        <w:pStyle w:val="BodyText"/>
-      </w:pPr>
-      <w:r>
-        <w:rPr>
-          <w:b/>
-          <w:bCs/>
+          <w:lang w:val="en"/>
         </w:rPr>
         <w:t xml:space="preserve">Languages:</w:t>
       </w:r>
       <w:r>
-        <w:t xml:space="preserve"> </w:t>
-      </w:r>
-      <w:r>
-        <w:t xml:space="preserve">English (native) · French (learning, final-year module — not yet working</w:t>
-      </w:r>
-      <w:r>
-        <w:t xml:space="preserve"> </w:t>
-      </w:r>
-      <w:r>
-        <w:t xml:space="preserve">proficiency)</w:t>
+        <w:rPr>
+          <w:lang w:val="en"/>
+        </w:rPr>
+        <w:t xml:space="preserve"> </w:t>
+      </w:r>
+      <w:r>
+        <w:rPr>
+          <w:lang w:val="en"/>
+        </w:rPr>
+        <w:t xml:space="preserve">English (native) · French (learning).</w:t>
       </w:r>
     </w:p>
     <w:bookmarkEnd w:id="14"/>
-    <w:bookmarkStart w:id="15" w:name="interests"/>
-    <w:p>
-      <w:pPr>
-        <w:pStyle w:val="Heading2"/>
-      </w:pPr>
-      <w:r>
-        <w:t xml:space="preserve">INTERESTS</w:t>
-      </w:r>
-    </w:p>
-    <w:p>
-      <w:pPr>
-        <w:pStyle w:val="FirstParagraph"/>
-      </w:pPr>
-      <w:r>
-        <w:t xml:space="preserve">AI as a structural force in geopolitics · AI sovereignty and the UK’s position · dual-use technology</w:t>
-      </w:r>
-      <w:r>
-        <w:t xml:space="preserve"> </w:t>
-      </w:r>
-      <w:r>
-        <w:t xml:space="preserve">and access asymmetry · cybersecurity, intelligence and diplomacy · the Cold War · the space between</w:t>
-      </w:r>
-      <w:r>
-        <w:t xml:space="preserve"> </w:t>
-      </w:r>
-      <w:r>
-        <w:t xml:space="preserve">peace and war.</w:t>
-      </w:r>
-    </w:p>
     <w:bookmarkEnd w:id="15"/>
-    <w:bookmarkEnd w:id="16"/>
     <w:sectPr>
       <w:footnotePr>
         <w:numRestart w:val="eachSect"/>
@@ -1380,24 +1020,6 @@
   <w:num w:numId="1002">
     <w:abstractNumId w:val="991"/>
   </w:num>
-  <w:num w:numId="1003">
-    <w:abstractNumId w:val="991"/>
-  </w:num>
-  <w:num w:numId="1004">
-    <w:abstractNumId w:val="991"/>
-  </w:num>
-  <w:num w:numId="1005">
-    <w:abstractNumId w:val="991"/>
-  </w:num>
-  <w:num w:numId="1006">
-    <w:abstractNumId w:val="991"/>
-  </w:num>
-  <w:num w:numId="1007">
-    <w:abstractNumId w:val="991"/>
-  </w:num>
-  <w:num w:numId="1008">
-    <w:abstractNumId w:val="991"/>
-  </w:num>
 </w:numbering>
 </file>
 
@@ -1409,7 +1031,7 @@
         <w:rFonts w:asciiTheme="minorHAnsi" w:cstheme="minorBidi" w:eastAsiaTheme="minorEastAsia" w:hAnsiTheme="minorHAnsi"/>
         <w:sz w:val="24"/>
         <w:szCs w:val="24"/>
-        <w:lang w:bidi="ar-SA" w:eastAsia="zh-CN" w:val="en-US"/>
+        <w:lang w:bidi="ar-SA" w:eastAsia="zh-CN" w:val="en"/>
       </w:rPr>
     </w:rPrDefault>
     <w:pPrDefault>

</xml_diff>